<commit_message>
slight changes in specifikacija zahteva and vizija sistema, plan testiranja done more or less
</commit_message>
<xml_diff>
--- a/documentation/D04_Spec_Zahteva.docx
+++ b/documentation/D04_Spec_Zahteva.docx
@@ -523,8 +523,6 @@
           <w:lang w:val="sr-Latn-CS"/>
         </w:rPr>
       </w:pPr>
-      <w:bookmarkStart w:id="0" w:name="_GoBack"/>
-      <w:bookmarkEnd w:id="0"/>
       <w:r>
         <w:rPr>
           <w:lang w:val="sr-Latn-CS"/>
@@ -3243,7 +3241,7 @@
           <w:lang w:val="sr-Latn-CS"/>
         </w:rPr>
       </w:pPr>
-      <w:bookmarkStart w:id="1" w:name="_Toc163018886"/>
+      <w:bookmarkStart w:id="0" w:name="_Toc163018886"/>
       <w:r>
         <w:rPr>
           <w:lang w:val="sr-Latn-CS"/>
@@ -3256,6 +3254,72 @@
         </w:rPr>
         <w:t xml:space="preserve"> dokumenta</w:t>
       </w:r>
+      <w:bookmarkEnd w:id="0"/>
+    </w:p>
+    <w:p>
+      <w:pPr>
+        <w:pStyle w:val="BodyText"/>
+        <w:rPr>
+          <w:lang w:val="sr-Latn-CS"/>
+        </w:rPr>
+      </w:pPr>
+      <w:r>
+        <w:rPr>
+          <w:lang w:val="sr-Latn-CS"/>
+        </w:rPr>
+        <w:t xml:space="preserve">Cilj ovog dokumenta je </w:t>
+      </w:r>
+      <w:r>
+        <w:rPr>
+          <w:lang w:val="sr-Latn-CS"/>
+        </w:rPr>
+        <w:t>specifikacija</w:t>
+      </w:r>
+      <w:r>
+        <w:rPr>
+          <w:lang w:val="sr-Latn-CS"/>
+        </w:rPr>
+        <w:t xml:space="preserve"> zahteva </w:t>
+      </w:r>
+      <w:r>
+        <w:rPr>
+          <w:lang w:val="sr-Latn-CS"/>
+        </w:rPr>
+        <w:t>u pogledu detaljnog opisa slučajeva korišćenja</w:t>
+      </w:r>
+      <w:r>
+        <w:rPr>
+          <w:lang w:val="sr-Latn-CS"/>
+        </w:rPr>
+        <w:t xml:space="preserve"> </w:t>
+      </w:r>
+      <w:r>
+        <w:rPr>
+          <w:lang w:val="sr-Latn-CS"/>
+        </w:rPr>
+        <w:t>OutfitFactory web aplikacije.</w:t>
+      </w:r>
+    </w:p>
+    <w:p>
+      <w:pPr>
+        <w:pStyle w:val="Heading1"/>
+        <w:rPr>
+          <w:lang w:val="sr-Latn-CS"/>
+        </w:rPr>
+      </w:pPr>
+      <w:bookmarkStart w:id="1" w:name="_Toc163018887"/>
+      <w:r>
+        <w:rPr>
+          <w:lang w:val="sr-Latn-CS"/>
+        </w:rPr>
+        <w:t>Opseg</w:t>
+      </w:r>
+      <w:r>
+        <w:rPr>
+          <w:lang w:val="sr-Latn-CS"/>
+        </w:rPr>
+        <w:t xml:space="preserve"> dokumenta</w:t>
+      </w:r>
       <w:bookmarkEnd w:id="1"/>
     </w:p>
     <w:p>
@@ -3269,25 +3333,49 @@
         <w:rPr>
           <w:lang w:val="sr-Latn-CS"/>
         </w:rPr>
-        <w:t xml:space="preserve">Cilj ovog dokumenta je </w:t>
-      </w:r>
-      <w:r>
-        <w:rPr>
-          <w:lang w:val="sr-Latn-CS"/>
-        </w:rPr>
-        <w:t>specifikacija</w:t>
-      </w:r>
-      <w:r>
-        <w:rPr>
-          <w:lang w:val="sr-Latn-CS"/>
-        </w:rPr>
-        <w:t xml:space="preserve"> zahteva </w:t>
-      </w:r>
-      <w:r>
-        <w:rPr>
-          <w:lang w:val="sr-Latn-CS"/>
-        </w:rPr>
-        <w:t>u pogledu detaljnog opisa slučajeva korišćenja</w:t>
+        <w:t>Dok</w:t>
+      </w:r>
+      <w:r>
+        <w:rPr>
+          <w:lang w:val="sr-Latn-CS"/>
+        </w:rPr>
+        <w:t>ument se odnosi na OutfitFactory društvenu mrežu koja</w:t>
+      </w:r>
+      <w:r>
+        <w:rPr>
+          <w:lang w:val="sr-Latn-CS"/>
+        </w:rPr>
+        <w:t xml:space="preserve"> će biti razvijen</w:t>
+      </w:r>
+      <w:r>
+        <w:rPr>
+          <w:lang w:val="sr-Latn-CS"/>
+        </w:rPr>
+        <w:t>a</w:t>
+      </w:r>
+      <w:r>
+        <w:rPr>
+          <w:lang w:val="sr-Latn-CS"/>
+        </w:rPr>
+        <w:t xml:space="preserve"> od strane</w:t>
+      </w:r>
+      <w:r>
+        <w:rPr>
+          <w:lang w:val="sr-Latn-CS"/>
+        </w:rPr>
+        <w:t xml:space="preserve"> tima GatoHeads</w:t>
+      </w:r>
+      <w:r>
+        <w:rPr>
+          <w:lang w:val="sr-Latn-CS"/>
+        </w:rPr>
+        <w:t xml:space="preserve">. Namena sistema </w:t>
+      </w:r>
+      <w:r>
+        <w:rPr>
+          <w:lang w:val="sr-Latn-CS"/>
+        </w:rPr>
+        <w:t>je efikasno prezentovanje,</w:t>
       </w:r>
       <w:r>
         <w:rPr>
@@ -3299,7 +3387,31 @@
         <w:rPr>
           <w:lang w:val="sr-Latn-CS"/>
         </w:rPr>
-        <w:t>OutfitFactory web aplikacije.</w:t>
+        <w:t>kreiranje</w:t>
+      </w:r>
+      <w:r>
+        <w:rPr>
+          <w:lang w:val="sr-Latn-CS"/>
+        </w:rPr>
+        <w:t xml:space="preserve">, deljenje i </w:t>
+      </w:r>
+      <w:r>
+        <w:rPr>
+          <w:lang w:val="sr-Latn-CS"/>
+        </w:rPr>
+        <w:t>održavanje sadržaja vezanih za</w:t>
+      </w:r>
+      <w:r>
+        <w:rPr>
+          <w:lang w:val="sr-Latn-CS"/>
+        </w:rPr>
+        <w:t xml:space="preserve"> odevne kombinacije sačinjenih od odeće dostupne za kupovinu na tržištu</w:t>
+      </w:r>
+      <w:r>
+        <w:rPr>
+          <w:lang w:val="sr-Latn-CS"/>
+        </w:rPr>
+        <w:t>.</w:t>
       </w:r>
     </w:p>
     <w:p>
@@ -3309,128 +3421,14 @@
           <w:lang w:val="sr-Latn-CS"/>
         </w:rPr>
       </w:pPr>
-      <w:bookmarkStart w:id="2" w:name="_Toc163018887"/>
-      <w:r>
-        <w:rPr>
-          <w:lang w:val="sr-Latn-CS"/>
-        </w:rPr>
-        <w:t>Opseg</w:t>
-      </w:r>
-      <w:r>
-        <w:rPr>
-          <w:lang w:val="sr-Latn-CS"/>
-        </w:rPr>
-        <w:t xml:space="preserve"> dokumenta</w:t>
+      <w:bookmarkStart w:id="2" w:name="_Toc163018888"/>
+      <w:r>
+        <w:rPr>
+          <w:lang w:val="sr-Latn-CS"/>
+        </w:rPr>
+        <w:t>Reference</w:t>
       </w:r>
       <w:bookmarkEnd w:id="2"/>
-    </w:p>
-    <w:p>
-      <w:pPr>
-        <w:pStyle w:val="BodyText"/>
-        <w:rPr>
-          <w:lang w:val="sr-Latn-CS"/>
-        </w:rPr>
-      </w:pPr>
-      <w:r>
-        <w:rPr>
-          <w:lang w:val="sr-Latn-CS"/>
-        </w:rPr>
-        <w:t>Dok</w:t>
-      </w:r>
-      <w:r>
-        <w:rPr>
-          <w:lang w:val="sr-Latn-CS"/>
-        </w:rPr>
-        <w:t>ument se odnosi na OutfitFactory društvenu mrežu koja</w:t>
-      </w:r>
-      <w:r>
-        <w:rPr>
-          <w:lang w:val="sr-Latn-CS"/>
-        </w:rPr>
-        <w:t xml:space="preserve"> će biti razvijen</w:t>
-      </w:r>
-      <w:r>
-        <w:rPr>
-          <w:lang w:val="sr-Latn-CS"/>
-        </w:rPr>
-        <w:t>a</w:t>
-      </w:r>
-      <w:r>
-        <w:rPr>
-          <w:lang w:val="sr-Latn-CS"/>
-        </w:rPr>
-        <w:t xml:space="preserve"> od strane</w:t>
-      </w:r>
-      <w:r>
-        <w:rPr>
-          <w:lang w:val="sr-Latn-CS"/>
-        </w:rPr>
-        <w:t xml:space="preserve"> tima GatoHeads</w:t>
-      </w:r>
-      <w:r>
-        <w:rPr>
-          <w:lang w:val="sr-Latn-CS"/>
-        </w:rPr>
-        <w:t xml:space="preserve">. Namena sistema </w:t>
-      </w:r>
-      <w:r>
-        <w:rPr>
-          <w:lang w:val="sr-Latn-CS"/>
-        </w:rPr>
-        <w:t>je efikasno prezentovanje,</w:t>
-      </w:r>
-      <w:r>
-        <w:rPr>
-          <w:lang w:val="sr-Latn-CS"/>
-        </w:rPr>
-        <w:t xml:space="preserve"> </w:t>
-      </w:r>
-      <w:r>
-        <w:rPr>
-          <w:lang w:val="sr-Latn-CS"/>
-        </w:rPr>
-        <w:t>kreiranje</w:t>
-      </w:r>
-      <w:r>
-        <w:rPr>
-          <w:lang w:val="sr-Latn-CS"/>
-        </w:rPr>
-        <w:t xml:space="preserve">, deljenje i </w:t>
-      </w:r>
-      <w:r>
-        <w:rPr>
-          <w:lang w:val="sr-Latn-CS"/>
-        </w:rPr>
-        <w:t>održavanje sadržaja vezanih za</w:t>
-      </w:r>
-      <w:r>
-        <w:rPr>
-          <w:lang w:val="sr-Latn-CS"/>
-        </w:rPr>
-        <w:t xml:space="preserve"> odevne kombinacije sačinjenih od odeće dostupne za kupovinu na tržištu</w:t>
-      </w:r>
-      <w:r>
-        <w:rPr>
-          <w:lang w:val="sr-Latn-CS"/>
-        </w:rPr>
-        <w:t>.</w:t>
-      </w:r>
-    </w:p>
-    <w:p>
-      <w:pPr>
-        <w:pStyle w:val="Heading1"/>
-        <w:rPr>
-          <w:lang w:val="sr-Latn-CS"/>
-        </w:rPr>
-      </w:pPr>
-      <w:bookmarkStart w:id="3" w:name="_Toc163018888"/>
-      <w:r>
-        <w:rPr>
-          <w:lang w:val="sr-Latn-CS"/>
-        </w:rPr>
-        <w:t>Reference</w:t>
-      </w:r>
-      <w:bookmarkEnd w:id="3"/>
     </w:p>
     <w:p>
       <w:pPr>
@@ -3512,7 +3510,7 @@
           <w:lang w:val="sr-Latn-CS"/>
         </w:rPr>
       </w:pPr>
-      <w:bookmarkStart w:id="4" w:name="_Toc163018889"/>
+      <w:bookmarkStart w:id="3" w:name="_Toc163018889"/>
       <w:r>
         <w:rPr>
           <w:lang w:val="sr-Latn-CS"/>
@@ -3525,7 +3523,7 @@
         </w:rPr>
         <w:t>korišćenja</w:t>
       </w:r>
-      <w:bookmarkEnd w:id="4"/>
+      <w:bookmarkEnd w:id="3"/>
     </w:p>
     <w:p>
       <w:pPr>
@@ -3584,7 +3582,7 @@
           <w:lang w:eastAsia="en-US"/>
         </w:rPr>
         <w:drawing>
-          <wp:inline distT="0" distB="0" distL="0" distR="0" wp14:anchorId="0F4B946A" wp14:editId="618950EA">
+          <wp:inline distT="0" distB="0" distL="0" distR="0" wp14:anchorId="10A9FAB8" wp14:editId="64041F23">
             <wp:extent cx="4542312" cy="4830087"/>
             <wp:effectExtent l="0" t="0" r="0" b="0"/>
             <wp:docPr id="1" name="Picture 1"/>
@@ -4009,13 +4007,61 @@
           <w:lang w:val="sr-Latn-CS"/>
         </w:rPr>
       </w:pPr>
-      <w:bookmarkStart w:id="5" w:name="_Toc163018890"/>
+      <w:bookmarkStart w:id="4" w:name="_Toc163018890"/>
       <w:r>
         <w:rPr>
           <w:lang w:val="sr-Latn-CS"/>
         </w:rPr>
         <w:t>Profili korisnika</w:t>
       </w:r>
+      <w:bookmarkEnd w:id="4"/>
+    </w:p>
+    <w:p>
+      <w:pPr>
+        <w:pStyle w:val="BodyText"/>
+        <w:rPr>
+          <w:lang w:val="sr-Latn-CS"/>
+        </w:rPr>
+      </w:pPr>
+      <w:r>
+        <w:rPr>
+          <w:lang w:val="sr-Latn-CS"/>
+        </w:rPr>
+        <w:t xml:space="preserve">Identifikovani su sledeći </w:t>
+      </w:r>
+      <w:r>
+        <w:rPr>
+          <w:lang w:val="sr-Latn-CS"/>
+        </w:rPr>
+        <w:t>profili</w:t>
+      </w:r>
+      <w:r>
+        <w:rPr>
+          <w:lang w:val="sr-Latn-CS"/>
+        </w:rPr>
+        <w:t xml:space="preserve"> korisnika društvene mreže OutfitFactory</w:t>
+      </w:r>
+      <w:r>
+        <w:rPr>
+          <w:lang w:val="sr-Latn-CS"/>
+        </w:rPr>
+        <w:t>:</w:t>
+      </w:r>
+    </w:p>
+    <w:p>
+      <w:pPr>
+        <w:pStyle w:val="Heading2"/>
+        <w:rPr>
+          <w:lang w:val="sr-Latn-CS"/>
+        </w:rPr>
+      </w:pPr>
+      <w:bookmarkStart w:id="5" w:name="_Toc163018891"/>
+      <w:r>
+        <w:rPr>
+          <w:lang w:val="sr-Latn-CS"/>
+        </w:rPr>
+        <w:t>Posetilac portala</w:t>
+      </w:r>
       <w:bookmarkEnd w:id="5"/>
     </w:p>
     <w:p>
@@ -4029,25 +4075,43 @@
         <w:rPr>
           <w:lang w:val="sr-Latn-CS"/>
         </w:rPr>
-        <w:t xml:space="preserve">Identifikovani su sledeći </w:t>
-      </w:r>
-      <w:r>
-        <w:rPr>
-          <w:lang w:val="sr-Latn-CS"/>
-        </w:rPr>
-        <w:t>profili</w:t>
-      </w:r>
-      <w:r>
-        <w:rPr>
-          <w:lang w:val="sr-Latn-CS"/>
-        </w:rPr>
-        <w:t xml:space="preserve"> korisnika društvene mreže OutfitFactory</w:t>
-      </w:r>
-      <w:r>
-        <w:rPr>
-          <w:lang w:val="sr-Latn-CS"/>
-        </w:rPr>
-        <w:t>:</w:t>
+        <w:t xml:space="preserve">Posetilac </w:t>
+      </w:r>
+      <w:r>
+        <w:rPr>
+          <w:lang w:val="sr-Latn-CS"/>
+        </w:rPr>
+        <w:t xml:space="preserve">društvene mreže </w:t>
+      </w:r>
+      <w:r>
+        <w:rPr>
+          <w:lang w:val="sr-Latn-CS"/>
+        </w:rPr>
+        <w:t xml:space="preserve">je osnovni </w:t>
+      </w:r>
+      <w:r>
+        <w:rPr>
+          <w:lang w:val="sr-Latn-CS"/>
+        </w:rPr>
+        <w:t>profil</w:t>
+      </w:r>
+      <w:r>
+        <w:rPr>
+          <w:lang w:val="sr-Latn-CS"/>
+        </w:rPr>
+        <w:t xml:space="preserve"> korisnika </w:t>
+      </w:r>
+      <w:r>
+        <w:rPr>
+          <w:lang w:val="sr-Latn-CS"/>
+        </w:rPr>
+        <w:t>koji sa najmanjim skupom funkcionalnosti na raspolaganju.</w:t>
+      </w:r>
+      <w:r>
+        <w:rPr>
+          <w:lang w:val="sr-Latn-CS"/>
+        </w:rPr>
+        <w:t xml:space="preserve"> Korisnici ovog tipa pristupaju portalu u cilju pregleda informacija koje su na njemu prezentovane. Pristup portalu u ulozi posetioca je slobodan, tj. ne zahteva prethodno prijavljivanje na portal.</w:t>
       </w:r>
     </w:p>
     <w:p>
@@ -4057,27 +4121,33 @@
           <w:lang w:val="sr-Latn-CS"/>
         </w:rPr>
       </w:pPr>
-      <w:bookmarkStart w:id="6" w:name="_Toc163018891"/>
-      <w:r>
-        <w:rPr>
-          <w:lang w:val="sr-Latn-CS"/>
-        </w:rPr>
-        <w:t>Posetilac portala</w:t>
+      <w:bookmarkStart w:id="6" w:name="_Toc163018892"/>
+      <w:r>
+        <w:rPr>
+          <w:lang w:val="sr-Latn-CS"/>
+        </w:rPr>
+        <w:t xml:space="preserve">Član </w:t>
       </w:r>
       <w:bookmarkEnd w:id="6"/>
-    </w:p>
-    <w:p>
-      <w:pPr>
-        <w:pStyle w:val="BodyText"/>
-        <w:rPr>
-          <w:lang w:val="sr-Latn-CS"/>
-        </w:rPr>
-      </w:pPr>
-      <w:r>
-        <w:rPr>
-          <w:lang w:val="sr-Latn-CS"/>
-        </w:rPr>
-        <w:t xml:space="preserve">Posetilac </w:t>
+      <w:r>
+        <w:rPr>
+          <w:lang w:val="sr-Latn-CS"/>
+        </w:rPr>
+        <w:t>društvene mreže</w:t>
+      </w:r>
+    </w:p>
+    <w:p>
+      <w:pPr>
+        <w:pStyle w:val="BodyText"/>
+        <w:rPr>
+          <w:lang w:val="sr-Latn-CS"/>
+        </w:rPr>
+      </w:pPr>
+      <w:r>
+        <w:rPr>
+          <w:lang w:val="sr-Latn-CS"/>
+        </w:rPr>
+        <w:t xml:space="preserve">Član </w:t>
       </w:r>
       <w:r>
         <w:rPr>
@@ -4089,7 +4159,7 @@
         <w:rPr>
           <w:lang w:val="sr-Latn-CS"/>
         </w:rPr>
-        <w:t xml:space="preserve">je osnovni </w:t>
+        <w:t xml:space="preserve">je </w:t>
       </w:r>
       <w:r>
         <w:rPr>
@@ -4101,19 +4171,108 @@
         <w:rPr>
           <w:lang w:val="sr-Latn-CS"/>
         </w:rPr>
-        <w:t xml:space="preserve"> korisnika </w:t>
-      </w:r>
-      <w:r>
-        <w:rPr>
-          <w:lang w:val="sr-Latn-CS"/>
-        </w:rPr>
-        <w:t>koji sa najmanjim skupom funkcionalnosti na raspolaganju.</w:t>
-      </w:r>
-      <w:r>
-        <w:rPr>
-          <w:lang w:val="sr-Latn-CS"/>
-        </w:rPr>
-        <w:t xml:space="preserve"> Korisnici ovog tipa pristupaju portalu u cilju pregleda informacija koje su na njemu prezentovane. Pristup portalu u ulozi posetioca je slobodan, tj. ne zahteva prethodno prijavljivanje na portal.</w:t>
+        <w:t xml:space="preserve"> korisnika koji obuhvata sve </w:t>
+      </w:r>
+      <w:r>
+        <w:rPr>
+          <w:lang w:val="sr-Latn-CS"/>
+        </w:rPr>
+        <w:t xml:space="preserve">korisnike sa nalogom na OutfitFactory društvenoj mreži. </w:t>
+      </w:r>
+      <w:r>
+        <w:rPr>
+          <w:lang w:val="sr-Latn-CS"/>
+        </w:rPr>
+        <w:t>Veza generali</w:t>
+      </w:r>
+      <w:r>
+        <w:rPr>
+          <w:lang w:val="sr-Latn-CS"/>
+        </w:rPr>
+        <w:t>zacije između člana društvene mreže i njenog posetioca</w:t>
+      </w:r>
+      <w:r>
+        <w:rPr>
+          <w:lang w:val="sr-Latn-CS"/>
+        </w:rPr>
+        <w:t xml:space="preserve"> je uvedena da ukaže na mogućnost pristupa svim os</w:t>
+      </w:r>
+      <w:r>
+        <w:rPr>
+          <w:lang w:val="sr-Latn-CS"/>
+        </w:rPr>
+        <w:t xml:space="preserve">novnim funkcionalnostima mreže </w:t>
+      </w:r>
+      <w:r>
+        <w:rPr>
+          <w:lang w:val="sr-Latn-CS"/>
+        </w:rPr>
+        <w:t>vezanim za pregled info</w:t>
+      </w:r>
+      <w:r>
+        <w:rPr>
+          <w:lang w:val="sr-Latn-CS"/>
+        </w:rPr>
+        <w:t>rmacija. Da bi član društvene mreže</w:t>
+      </w:r>
+      <w:r>
+        <w:rPr>
+          <w:lang w:val="sr-Latn-CS"/>
+        </w:rPr>
+        <w:t xml:space="preserve"> mogao da ažurira podatke o sebi </w:t>
+      </w:r>
+      <w:r>
+        <w:rPr>
+          <w:lang w:val="sr-Latn-CS"/>
+        </w:rPr>
+        <w:t>i stvara odevne kombinacije neop</w:t>
+      </w:r>
+      <w:r>
+        <w:rPr>
+          <w:lang w:val="sr-Latn-CS"/>
+        </w:rPr>
+        <w:t xml:space="preserve">hodno </w:t>
+      </w:r>
+      <w:r>
+        <w:rPr>
+          <w:lang w:val="sr-Latn-CS"/>
+        </w:rPr>
+        <w:t xml:space="preserve">je prethodno </w:t>
+      </w:r>
+      <w:r>
+        <w:rPr>
+          <w:lang w:val="sr-Latn-CS"/>
+        </w:rPr>
+        <w:t xml:space="preserve">prijavljivanje korisnika. </w:t>
+      </w:r>
+    </w:p>
+    <w:p>
+      <w:pPr>
+        <w:pStyle w:val="Heading1"/>
+        <w:rPr>
+          <w:lang w:val="sr-Latn-CS"/>
+        </w:rPr>
+      </w:pPr>
+      <w:bookmarkStart w:id="7" w:name="_Toc163018896"/>
+      <w:r>
+        <w:rPr>
+          <w:lang w:val="sr-Latn-CS"/>
+        </w:rPr>
+        <w:t>Opis slučajeva korišćenja</w:t>
+      </w:r>
+      <w:bookmarkEnd w:id="7"/>
+    </w:p>
+    <w:p>
+      <w:pPr>
+        <w:rPr>
+          <w:lang w:val="sr-Latn-CS"/>
+        </w:rPr>
+      </w:pPr>
+      <w:r>
+        <w:rPr>
+          <w:lang w:val="sr-Latn-CS"/>
+        </w:rPr>
+        <w:t>//prikaz komenara treba da s e dodoa i da se poređaju</w:t>
       </w:r>
     </w:p>
     <w:p>
@@ -4123,175 +4282,14 @@
           <w:lang w:val="sr-Latn-CS"/>
         </w:rPr>
       </w:pPr>
-      <w:bookmarkStart w:id="7" w:name="_Toc163018892"/>
-      <w:r>
-        <w:rPr>
-          <w:lang w:val="sr-Latn-CS"/>
-        </w:rPr>
-        <w:t xml:space="preserve">Član </w:t>
-      </w:r>
-      <w:bookmarkEnd w:id="7"/>
-      <w:r>
-        <w:rPr>
-          <w:lang w:val="sr-Latn-CS"/>
-        </w:rPr>
-        <w:t>društvene mreže</w:t>
-      </w:r>
-    </w:p>
-    <w:p>
-      <w:pPr>
-        <w:pStyle w:val="BodyText"/>
-        <w:rPr>
-          <w:lang w:val="sr-Latn-CS"/>
-        </w:rPr>
-      </w:pPr>
-      <w:r>
-        <w:rPr>
-          <w:lang w:val="sr-Latn-CS"/>
-        </w:rPr>
-        <w:t xml:space="preserve">Član </w:t>
-      </w:r>
-      <w:r>
-        <w:rPr>
-          <w:lang w:val="sr-Latn-CS"/>
-        </w:rPr>
-        <w:t xml:space="preserve">društvene mreže </w:t>
-      </w:r>
-      <w:r>
-        <w:rPr>
-          <w:lang w:val="sr-Latn-CS"/>
-        </w:rPr>
-        <w:t xml:space="preserve">je </w:t>
-      </w:r>
-      <w:r>
-        <w:rPr>
-          <w:lang w:val="sr-Latn-CS"/>
-        </w:rPr>
-        <w:t>profil</w:t>
-      </w:r>
-      <w:r>
-        <w:rPr>
-          <w:lang w:val="sr-Latn-CS"/>
-        </w:rPr>
-        <w:t xml:space="preserve"> korisnika koji obuhvata sve </w:t>
-      </w:r>
-      <w:r>
-        <w:rPr>
-          <w:lang w:val="sr-Latn-CS"/>
-        </w:rPr>
-        <w:t xml:space="preserve">korisnike sa nalogom na OutfitFactory društvenoj mreži. </w:t>
-      </w:r>
-      <w:r>
-        <w:rPr>
-          <w:lang w:val="sr-Latn-CS"/>
-        </w:rPr>
-        <w:t>Veza generali</w:t>
-      </w:r>
-      <w:r>
-        <w:rPr>
-          <w:lang w:val="sr-Latn-CS"/>
-        </w:rPr>
-        <w:t>zacije između člana društvene mreže i njenog posetioca</w:t>
-      </w:r>
-      <w:r>
-        <w:rPr>
-          <w:lang w:val="sr-Latn-CS"/>
-        </w:rPr>
-        <w:t xml:space="preserve"> je uvedena da ukaže na mogućnost pristupa svim os</w:t>
-      </w:r>
-      <w:r>
-        <w:rPr>
-          <w:lang w:val="sr-Latn-CS"/>
-        </w:rPr>
-        <w:t xml:space="preserve">novnim funkcionalnostima mreže </w:t>
-      </w:r>
-      <w:r>
-        <w:rPr>
-          <w:lang w:val="sr-Latn-CS"/>
-        </w:rPr>
-        <w:t>vezanim za pregled info</w:t>
-      </w:r>
-      <w:r>
-        <w:rPr>
-          <w:lang w:val="sr-Latn-CS"/>
-        </w:rPr>
-        <w:t>rmacija. Da bi član društvene mreže</w:t>
-      </w:r>
-      <w:r>
-        <w:rPr>
-          <w:lang w:val="sr-Latn-CS"/>
-        </w:rPr>
-        <w:t xml:space="preserve"> mogao da ažurira podatke o sebi </w:t>
-      </w:r>
-      <w:r>
-        <w:rPr>
-          <w:lang w:val="sr-Latn-CS"/>
-        </w:rPr>
-        <w:t>i stvara odevne kombinacije neop</w:t>
-      </w:r>
-      <w:r>
-        <w:rPr>
-          <w:lang w:val="sr-Latn-CS"/>
-        </w:rPr>
-        <w:t xml:space="preserve">hodno </w:t>
-      </w:r>
-      <w:r>
-        <w:rPr>
-          <w:lang w:val="sr-Latn-CS"/>
-        </w:rPr>
-        <w:t xml:space="preserve">je prethodno </w:t>
-      </w:r>
-      <w:r>
-        <w:rPr>
-          <w:lang w:val="sr-Latn-CS"/>
-        </w:rPr>
-        <w:t xml:space="preserve">prijavljivanje korisnika. </w:t>
-      </w:r>
-    </w:p>
-    <w:p>
-      <w:pPr>
-        <w:pStyle w:val="Heading1"/>
-        <w:rPr>
-          <w:lang w:val="sr-Latn-CS"/>
-        </w:rPr>
-      </w:pPr>
-      <w:bookmarkStart w:id="8" w:name="_Toc163018896"/>
-      <w:r>
-        <w:rPr>
-          <w:lang w:val="sr-Latn-CS"/>
-        </w:rPr>
-        <w:t>Opis slučajeva korišćenja</w:t>
+      <w:bookmarkStart w:id="8" w:name="_Toc163018899"/>
+      <w:r>
+        <w:rPr>
+          <w:lang w:val="sr-Latn-CS"/>
+        </w:rPr>
+        <w:t xml:space="preserve">Pregled </w:t>
       </w:r>
       <w:bookmarkEnd w:id="8"/>
-    </w:p>
-    <w:p>
-      <w:pPr>
-        <w:rPr>
-          <w:lang w:val="sr-Latn-CS"/>
-        </w:rPr>
-      </w:pPr>
-      <w:r>
-        <w:rPr>
-          <w:lang w:val="sr-Latn-CS"/>
-        </w:rPr>
-        <w:t>//prikaz komenara treba da s e dodoa i da se poređaju</w:t>
-      </w:r>
-    </w:p>
-    <w:p>
-      <w:pPr>
-        <w:pStyle w:val="Heading2"/>
-        <w:rPr>
-          <w:lang w:val="sr-Latn-CS"/>
-        </w:rPr>
-      </w:pPr>
-      <w:bookmarkStart w:id="9" w:name="_Toc163018899"/>
-      <w:r>
-        <w:rPr>
-          <w:lang w:val="sr-Latn-CS"/>
-        </w:rPr>
-        <w:t xml:space="preserve">Pregled </w:t>
-      </w:r>
-      <w:bookmarkEnd w:id="9"/>
       <w:r>
         <w:rPr>
           <w:lang w:val="sr-Latn-CS"/>
@@ -4580,7 +4578,7 @@
           <w:lang w:val="sr-Latn-CS"/>
         </w:rPr>
       </w:pPr>
-      <w:bookmarkStart w:id="10" w:name="_Toc163018900"/>
+      <w:bookmarkStart w:id="9" w:name="_Toc163018900"/>
       <w:r>
         <w:rPr>
           <w:lang w:val="sr-Latn-CS"/>
@@ -4601,7 +4599,7 @@
         </w:rPr>
         <w:t xml:space="preserve">Pregled </w:t>
       </w:r>
-      <w:bookmarkEnd w:id="10"/>
+      <w:bookmarkEnd w:id="9"/>
       <w:r>
         <w:rPr>
           <w:lang w:val="sr-Latn-CS"/>
@@ -4678,13 +4676,13 @@
         <w:rPr>
           <w:lang w:val="sr-Latn-CS"/>
         </w:rPr>
-        <w:t>Član labora</w:t>
-      </w:r>
-      <w:r>
-        <w:rPr>
-          <w:lang w:val="sr-Latn-CS"/>
-        </w:rPr>
-        <w:t>torije</w:t>
+        <w:t>Član</w:t>
+      </w:r>
+      <w:r>
+        <w:rPr>
+          <w:lang w:val="sr-Latn-CS"/>
+        </w:rPr>
+        <w:t xml:space="preserve"> društvene mreže</w:t>
       </w:r>
       <w:r>
         <w:rPr>
@@ -4872,7 +4870,7 @@
           <w:lang w:val="sr-Latn-CS"/>
         </w:rPr>
       </w:pPr>
-      <w:bookmarkStart w:id="11" w:name="_Toc163018901"/>
+      <w:bookmarkStart w:id="10" w:name="_Toc163018901"/>
       <w:r>
         <w:rPr>
           <w:lang w:val="sr-Latn-CS"/>
@@ -4885,7 +4883,7 @@
         </w:rPr>
         <w:t>profila</w:t>
       </w:r>
-      <w:bookmarkEnd w:id="11"/>
+      <w:bookmarkEnd w:id="10"/>
       <w:r>
         <w:rPr>
           <w:lang w:val="sr-Latn-CS"/>
@@ -5215,7 +5213,19 @@
         <w:rPr>
           <w:lang w:val="sr-Latn-CS"/>
         </w:rPr>
-        <w:t>nje korisnika u društvenu mrežu sa parametrima: email adresa, željeno korisničko ime i šifra</w:t>
+        <w:t xml:space="preserve">nje korisnika u </w:t>
+      </w:r>
+      <w:r>
+        <w:rPr>
+          <w:lang w:val="sr-Latn-CS"/>
+        </w:rPr>
+        <w:t xml:space="preserve">društvenu mrežu sa parametrima: </w:t>
+      </w:r>
+      <w:r>
+        <w:rPr>
+          <w:lang w:val="sr-Latn-CS"/>
+        </w:rPr>
+        <w:t>email adresa, željeno korisničko ime i šifra</w:t>
       </w:r>
       <w:r>
         <w:rPr>
@@ -5254,7 +5264,19 @@
         <w:rPr>
           <w:lang w:val="sr-Latn-CS"/>
         </w:rPr>
-        <w:t>Posetilac portala.</w:t>
+        <w:t>Posetilac</w:t>
+      </w:r>
+      <w:r>
+        <w:rPr>
+          <w:lang w:val="sr-Latn-CS"/>
+        </w:rPr>
+        <w:t xml:space="preserve"> društvene mreže</w:t>
+      </w:r>
+      <w:r>
+        <w:rPr>
+          <w:lang w:val="sr-Latn-CS"/>
+        </w:rPr>
+        <w:t>.</w:t>
       </w:r>
     </w:p>
     <w:p>
@@ -6158,18 +6180,6 @@
         </w:rPr>
         <w:t>Odjavljivanje</w:t>
       </w:r>
-      <w:r>
-        <w:rPr>
-          <w:lang w:val="sr-Latn-CS"/>
-        </w:rPr>
-        <w:t xml:space="preserve"> </w:t>
-      </w:r>
-      <w:r>
-        <w:rPr>
-          <w:lang w:val="sr-Latn-CS"/>
-        </w:rPr>
-        <w:t>korisnika</w:t>
-      </w:r>
     </w:p>
     <w:p>
       <w:pPr>
@@ -6820,8 +6830,61 @@
           <w:lang w:val="sr-Latn-CS"/>
         </w:rPr>
       </w:pPr>
-      <w:r>
-        <w:t>Korisnik popunjava polje za opis odevne kombinacije.</w:t>
+      <w:proofErr w:type="spellStart"/>
+      <w:r>
+        <w:t>Korisnik</w:t>
+      </w:r>
+      <w:proofErr w:type="spellEnd"/>
+      <w:r>
+        <w:t xml:space="preserve"> </w:t>
+      </w:r>
+      <w:proofErr w:type="spellStart"/>
+      <w:r>
+        <w:t>popunjava</w:t>
+      </w:r>
+      <w:proofErr w:type="spellEnd"/>
+      <w:r>
+        <w:t xml:space="preserve"> </w:t>
+      </w:r>
+      <w:proofErr w:type="spellStart"/>
+      <w:r>
+        <w:t>polje</w:t>
+      </w:r>
+      <w:proofErr w:type="spellEnd"/>
+      <w:r>
+        <w:t xml:space="preserve"> </w:t>
+      </w:r>
+      <w:proofErr w:type="spellStart"/>
+      <w:r>
+        <w:t>za</w:t>
+      </w:r>
+      <w:proofErr w:type="spellEnd"/>
+      <w:r>
+        <w:t xml:space="preserve"> </w:t>
+      </w:r>
+      <w:proofErr w:type="spellStart"/>
+      <w:r>
+        <w:t>opis</w:t>
+      </w:r>
+      <w:proofErr w:type="spellEnd"/>
+      <w:r>
+        <w:t xml:space="preserve"> </w:t>
+      </w:r>
+      <w:proofErr w:type="spellStart"/>
+      <w:r>
+        <w:t>odevne</w:t>
+      </w:r>
+      <w:proofErr w:type="spellEnd"/>
+      <w:r>
+        <w:t xml:space="preserve"> </w:t>
+      </w:r>
+      <w:proofErr w:type="spellStart"/>
+      <w:r>
+        <w:t>kombinacije</w:t>
+      </w:r>
+      <w:proofErr w:type="spellEnd"/>
+      <w:r>
+        <w:t>.</w:t>
       </w:r>
     </w:p>
     <w:p>
@@ -6835,8 +6898,77 @@
           <w:lang w:val="sr-Latn-CS"/>
         </w:rPr>
       </w:pPr>
-      <w:r>
-        <w:t>Vrši se provera informacija [izuzetak: kombinacija sadrži samo jedan artikal].</w:t>
+      <w:proofErr w:type="spellStart"/>
+      <w:r>
+        <w:t>Vrši</w:t>
+      </w:r>
+      <w:proofErr w:type="spellEnd"/>
+      <w:r>
+        <w:t xml:space="preserve"> se </w:t>
+      </w:r>
+      <w:proofErr w:type="spellStart"/>
+      <w:r>
+        <w:t>provera</w:t>
+      </w:r>
+      <w:proofErr w:type="spellEnd"/>
+      <w:r>
+        <w:t xml:space="preserve"> </w:t>
+      </w:r>
+      <w:proofErr w:type="spellStart"/>
+      <w:r>
+        <w:t>informacija</w:t>
+      </w:r>
+      <w:proofErr w:type="spellEnd"/>
+      <w:r>
+        <w:t xml:space="preserve"> [</w:t>
+      </w:r>
+      <w:proofErr w:type="spellStart"/>
+      <w:r>
+        <w:t>izuzetak</w:t>
+      </w:r>
+      <w:proofErr w:type="spellEnd"/>
+      <w:r>
+        <w:t xml:space="preserve">: </w:t>
+      </w:r>
+      <w:proofErr w:type="spellStart"/>
+      <w:r>
+        <w:t>kombinacija</w:t>
+      </w:r>
+      <w:proofErr w:type="spellEnd"/>
+      <w:r>
+        <w:t xml:space="preserve"> </w:t>
+      </w:r>
+      <w:proofErr w:type="spellStart"/>
+      <w:r>
+        <w:t>sadrži</w:t>
+      </w:r>
+      <w:proofErr w:type="spellEnd"/>
+      <w:r>
+        <w:t xml:space="preserve"> </w:t>
+      </w:r>
+      <w:proofErr w:type="spellStart"/>
+      <w:r>
+        <w:t>samo</w:t>
+      </w:r>
+      <w:proofErr w:type="spellEnd"/>
+      <w:r>
+        <w:t xml:space="preserve"> </w:t>
+      </w:r>
+      <w:proofErr w:type="spellStart"/>
+      <w:r>
+        <w:t>jedan</w:t>
+      </w:r>
+      <w:proofErr w:type="spellEnd"/>
+      <w:r>
+        <w:t xml:space="preserve"> </w:t>
+      </w:r>
+      <w:proofErr w:type="spellStart"/>
+      <w:r>
+        <w:t>artikal</w:t>
+      </w:r>
+      <w:proofErr w:type="spellEnd"/>
+      <w:r>
+        <w:t>].</w:t>
       </w:r>
     </w:p>
     <w:p>
@@ -6850,8 +6982,69 @@
           <w:lang w:val="sr-Latn-CS"/>
         </w:rPr>
       </w:pPr>
-      <w:r>
-        <w:t>Vrši se dodavanje objave i odevne kombinacije u bazi podataka.</w:t>
+      <w:proofErr w:type="spellStart"/>
+      <w:r>
+        <w:t>Vrši</w:t>
+      </w:r>
+      <w:proofErr w:type="spellEnd"/>
+      <w:r>
+        <w:t xml:space="preserve"> se </w:t>
+      </w:r>
+      <w:proofErr w:type="spellStart"/>
+      <w:r>
+        <w:t>dodavanje</w:t>
+      </w:r>
+      <w:proofErr w:type="spellEnd"/>
+      <w:r>
+        <w:t xml:space="preserve"> </w:t>
+      </w:r>
+      <w:proofErr w:type="spellStart"/>
+      <w:r>
+        <w:t>objave</w:t>
+      </w:r>
+      <w:proofErr w:type="spellEnd"/>
+      <w:r>
+        <w:t xml:space="preserve"> </w:t>
+      </w:r>
+      <w:proofErr w:type="spellStart"/>
+      <w:r>
+        <w:t>i</w:t>
+      </w:r>
+      <w:proofErr w:type="spellEnd"/>
+      <w:r>
+        <w:t xml:space="preserve"> </w:t>
+      </w:r>
+      <w:proofErr w:type="spellStart"/>
+      <w:r>
+        <w:t>odevne</w:t>
+      </w:r>
+      <w:proofErr w:type="spellEnd"/>
+      <w:r>
+        <w:t xml:space="preserve"> </w:t>
+      </w:r>
+      <w:proofErr w:type="spellStart"/>
+      <w:r>
+        <w:t>kombinacije</w:t>
+      </w:r>
+      <w:proofErr w:type="spellEnd"/>
+      <w:r>
+        <w:t xml:space="preserve"> u </w:t>
+      </w:r>
+      <w:proofErr w:type="spellStart"/>
+      <w:r>
+        <w:t>bazi</w:t>
+      </w:r>
+      <w:proofErr w:type="spellEnd"/>
+      <w:r>
+        <w:t xml:space="preserve"> </w:t>
+      </w:r>
+      <w:proofErr w:type="spellStart"/>
+      <w:r>
+        <w:t>podataka</w:t>
+      </w:r>
+      <w:proofErr w:type="spellEnd"/>
+      <w:r>
+        <w:t>.</w:t>
       </w:r>
     </w:p>
     <w:p>
@@ -6901,13 +7094,79 @@
       <w:r>
         <w:t>[</w:t>
       </w:r>
+      <w:proofErr w:type="spellStart"/>
       <w:r>
         <w:rPr>
           <w:i/>
           <w:iCs/>
         </w:rPr>
-        <w:t>Kombinacija sadrži samo jedan artikal</w:t>
-      </w:r>
+        <w:t>Kombinacija</w:t>
+      </w:r>
+      <w:proofErr w:type="spellEnd"/>
+      <w:r>
+        <w:rPr>
+          <w:i/>
+          <w:iCs/>
+        </w:rPr>
+        <w:t xml:space="preserve"> </w:t>
+      </w:r>
+      <w:proofErr w:type="spellStart"/>
+      <w:r>
+        <w:rPr>
+          <w:i/>
+          <w:iCs/>
+        </w:rPr>
+        <w:t>sadrži</w:t>
+      </w:r>
+      <w:proofErr w:type="spellEnd"/>
+      <w:r>
+        <w:rPr>
+          <w:i/>
+          <w:iCs/>
+        </w:rPr>
+        <w:t xml:space="preserve"> </w:t>
+      </w:r>
+      <w:proofErr w:type="spellStart"/>
+      <w:r>
+        <w:rPr>
+          <w:i/>
+          <w:iCs/>
+        </w:rPr>
+        <w:t>samo</w:t>
+      </w:r>
+      <w:proofErr w:type="spellEnd"/>
+      <w:r>
+        <w:rPr>
+          <w:i/>
+          <w:iCs/>
+        </w:rPr>
+        <w:t xml:space="preserve"> </w:t>
+      </w:r>
+      <w:proofErr w:type="spellStart"/>
+      <w:r>
+        <w:rPr>
+          <w:i/>
+          <w:iCs/>
+        </w:rPr>
+        <w:t>jedan</w:t>
+      </w:r>
+      <w:proofErr w:type="spellEnd"/>
+      <w:r>
+        <w:rPr>
+          <w:i/>
+          <w:iCs/>
+        </w:rPr>
+        <w:t xml:space="preserve"> </w:t>
+      </w:r>
+      <w:proofErr w:type="spellStart"/>
+      <w:r>
+        <w:rPr>
+          <w:i/>
+          <w:iCs/>
+        </w:rPr>
+        <w:t>artikal</w:t>
+      </w:r>
+      <w:proofErr w:type="spellEnd"/>
       <w:r>
         <w:t xml:space="preserve">] </w:t>
       </w:r>
@@ -6973,7 +7232,7 @@
           <w:lang w:val="sr-Latn-CS"/>
         </w:rPr>
       </w:pPr>
-      <w:bookmarkStart w:id="12" w:name="_Toc163018909"/>
+      <w:bookmarkStart w:id="11" w:name="_Toc163018909"/>
       <w:r>
         <w:rPr>
           <w:b/>
@@ -7006,10 +7265,11 @@
         <w:rPr>
           <w:b/>
           <w:bCs/>
-          <w:lang w:val="sr-Latn-CS"/>
+          <w:noProof/>
+          <w:lang w:eastAsia="en-US"/>
         </w:rPr>
         <w:drawing>
-          <wp:inline distT="0" distB="0" distL="0" distR="0" wp14:anchorId="6FD7BA32" wp14:editId="55CE8516">
+          <wp:inline distT="0" distB="0" distL="0" distR="0" wp14:anchorId="5DF153EA" wp14:editId="0E2D1C7D">
             <wp:extent cx="5588644" cy="3212276"/>
             <wp:effectExtent l="0" t="0" r="0" b="0"/>
             <wp:docPr id="13" name="Picture 13"/>
@@ -7056,9 +7316,9 @@
         <w:rPr>
           <w:lang w:val="sr-Latn-CS"/>
         </w:rPr>
-        <w:t xml:space="preserve">Brisanje postojeće </w:t>
-      </w:r>
-      <w:bookmarkEnd w:id="12"/>
+        <w:t xml:space="preserve">Brisanje </w:t>
+      </w:r>
+      <w:bookmarkEnd w:id="11"/>
       <w:r>
         <w:rPr>
           <w:lang w:val="sr-Latn-CS"/>
@@ -7351,9 +7611,11 @@
           <w:lang w:val="sr-Latn-CS"/>
         </w:rPr>
       </w:pPr>
+      <w:proofErr w:type="spellStart"/>
       <w:r>
         <w:t>Vr</w:t>
       </w:r>
+      <w:proofErr w:type="spellEnd"/>
       <w:r>
         <w:rPr>
           <w:lang w:val="sr-Latn-CS"/>
@@ -7438,8 +7700,13 @@
           <w:lang w:val="sr-Latn-CS"/>
         </w:rPr>
       </w:pPr>
-      <w:r>
-        <w:t>Nema.</w:t>
+      <w:proofErr w:type="spellStart"/>
+      <w:r>
+        <w:t>Nema</w:t>
+      </w:r>
+      <w:proofErr w:type="spellEnd"/>
+      <w:r>
+        <w:t>.</w:t>
       </w:r>
     </w:p>
     <w:p>
@@ -7881,7 +8148,7 @@
           <w:lang w:val="sr-Latn-CS"/>
         </w:rPr>
       </w:pPr>
-      <w:bookmarkStart w:id="13" w:name="_Toc163018912"/>
+      <w:bookmarkStart w:id="12" w:name="_Toc163018912"/>
       <w:r>
         <w:rPr>
           <w:i/>
@@ -8251,7 +8518,7 @@
         </w:rPr>
         <w:t>a</w:t>
       </w:r>
-      <w:bookmarkEnd w:id="13"/>
+      <w:bookmarkEnd w:id="12"/>
     </w:p>
     <w:p>
       <w:pPr>
@@ -8570,7 +8837,7 @@
           <w:lang w:val="sr-Latn-CS"/>
         </w:rPr>
       </w:pPr>
-      <w:bookmarkStart w:id="14" w:name="_Toc163018914"/>
+      <w:bookmarkStart w:id="13" w:name="_Toc163018914"/>
       <w:r>
         <w:rPr>
           <w:lang w:val="sr-Latn-CS"/>
@@ -8901,7 +9168,7 @@
         <w:t>za jedan.</w:t>
       </w:r>
     </w:p>
-    <w:bookmarkEnd w:id="14"/>
+    <w:bookmarkEnd w:id="13"/>
     <w:p>
       <w:pPr>
         <w:pStyle w:val="Heading2"/>
@@ -9333,22 +9600,112 @@
       <w:r>
         <w:t>[</w:t>
       </w:r>
+      <w:proofErr w:type="spellStart"/>
       <w:r>
         <w:rPr>
           <w:i/>
         </w:rPr>
-        <w:t>Komentar je predugačak</w:t>
-      </w:r>
-      <w:r>
-        <w:t xml:space="preserve">] Prikazuje se iskačući prozor </w:t>
-      </w:r>
+        <w:t>Komentar</w:t>
+      </w:r>
+      <w:proofErr w:type="spellEnd"/>
+      <w:r>
+        <w:rPr>
+          <w:i/>
+        </w:rPr>
+        <w:t xml:space="preserve"> je </w:t>
+      </w:r>
+      <w:proofErr w:type="spellStart"/>
+      <w:r>
+        <w:rPr>
+          <w:i/>
+        </w:rPr>
+        <w:t>predugačak</w:t>
+      </w:r>
+      <w:proofErr w:type="spellEnd"/>
+      <w:r>
+        <w:t xml:space="preserve">] </w:t>
+      </w:r>
+      <w:proofErr w:type="spellStart"/>
+      <w:r>
+        <w:t>Prikazuje</w:t>
+      </w:r>
+      <w:proofErr w:type="spellEnd"/>
+      <w:r>
+        <w:t xml:space="preserve"> se </w:t>
+      </w:r>
+      <w:proofErr w:type="spellStart"/>
+      <w:r>
+        <w:t>iskačući</w:t>
+      </w:r>
+      <w:proofErr w:type="spellEnd"/>
+      <w:r>
+        <w:t xml:space="preserve"> </w:t>
+      </w:r>
+      <w:proofErr w:type="spellStart"/>
+      <w:r>
+        <w:t>prozor</w:t>
+      </w:r>
+      <w:proofErr w:type="spellEnd"/>
+      <w:r>
+        <w:t xml:space="preserve"> </w:t>
+      </w:r>
+      <w:proofErr w:type="spellStart"/>
       <w:proofErr w:type="gramStart"/>
       <w:r>
         <w:t>sa</w:t>
       </w:r>
+      <w:proofErr w:type="spellEnd"/>
       <w:proofErr w:type="gramEnd"/>
       <w:r>
-        <w:t xml:space="preserve"> trenutnom dužinom komentara i dozvoljenom dužinom.</w:t>
+        <w:t xml:space="preserve"> </w:t>
+      </w:r>
+      <w:proofErr w:type="spellStart"/>
+      <w:r>
+        <w:t>trenutnom</w:t>
+      </w:r>
+      <w:proofErr w:type="spellEnd"/>
+      <w:r>
+        <w:t xml:space="preserve"> </w:t>
+      </w:r>
+      <w:proofErr w:type="spellStart"/>
+      <w:r>
+        <w:t>dužinom</w:t>
+      </w:r>
+      <w:proofErr w:type="spellEnd"/>
+      <w:r>
+        <w:t xml:space="preserve"> </w:t>
+      </w:r>
+      <w:proofErr w:type="spellStart"/>
+      <w:r>
+        <w:t>komentara</w:t>
+      </w:r>
+      <w:proofErr w:type="spellEnd"/>
+      <w:r>
+        <w:t xml:space="preserve"> </w:t>
+      </w:r>
+      <w:proofErr w:type="spellStart"/>
+      <w:r>
+        <w:t>i</w:t>
+      </w:r>
+      <w:proofErr w:type="spellEnd"/>
+      <w:r>
+        <w:t xml:space="preserve"> </w:t>
+      </w:r>
+      <w:proofErr w:type="spellStart"/>
+      <w:r>
+        <w:t>dozvoljenom</w:t>
+      </w:r>
+      <w:proofErr w:type="spellEnd"/>
+      <w:r>
+        <w:t xml:space="preserve"> </w:t>
+      </w:r>
+      <w:proofErr w:type="spellStart"/>
+      <w:r>
+        <w:t>dužinom</w:t>
+      </w:r>
+      <w:proofErr w:type="spellEnd"/>
+      <w:r>
+        <w:t>.</w:t>
       </w:r>
     </w:p>
     <w:p>
@@ -9391,7 +9748,7 @@
           <w:lang w:val="sr-Latn-CS"/>
         </w:rPr>
       </w:pPr>
-      <w:bookmarkStart w:id="15" w:name="_Toc163018916"/>
+      <w:bookmarkStart w:id="14" w:name="_Toc163018916"/>
       <w:r>
         <w:rPr>
           <w:lang w:val="sr-Latn-CS"/>
@@ -9763,8 +10120,13 @@
       <w:pPr>
         <w:pStyle w:val="BodyText"/>
       </w:pPr>
-      <w:r>
-        <w:t>Nema.</w:t>
+      <w:proofErr w:type="spellStart"/>
+      <w:r>
+        <w:t>Nema</w:t>
+      </w:r>
+      <w:proofErr w:type="spellEnd"/>
+      <w:r>
+        <w:t>.</w:t>
       </w:r>
     </w:p>
     <w:p>
@@ -10057,8 +10419,13 @@
       <w:pPr>
         <w:pStyle w:val="BodyText"/>
       </w:pPr>
-      <w:r>
-        <w:t>Nema.</w:t>
+      <w:proofErr w:type="spellStart"/>
+      <w:r>
+        <w:t>Nema</w:t>
+      </w:r>
+      <w:proofErr w:type="spellEnd"/>
+      <w:r>
+        <w:t>.</w:t>
       </w:r>
     </w:p>
     <w:p>
@@ -10433,13 +10800,178 @@
       <w:pPr>
         <w:pStyle w:val="BodyText"/>
       </w:pPr>
-      <w:r>
+      <w:proofErr w:type="spellStart"/>
+      <w:r>
+        <w:t>Nema</w:t>
+      </w:r>
+      <w:proofErr w:type="spellEnd"/>
+      <w:r>
+        <w:t>.</w:t>
+      </w:r>
+    </w:p>
+    <w:p>
+      <w:pPr>
+        <w:pStyle w:val="BodyText"/>
+        <w:keepNext/>
+        <w:rPr>
+          <w:b/>
+          <w:bCs/>
+          <w:lang w:val="sr-Latn-CS"/>
+        </w:rPr>
+      </w:pPr>
+      <w:r>
+        <w:rPr>
+          <w:b/>
+          <w:bCs/>
+          <w:lang w:val="sr-Latn-CS"/>
+        </w:rPr>
+        <w:t>Posledice:</w:t>
+      </w:r>
+    </w:p>
+    <w:p>
+      <w:pPr>
+        <w:pStyle w:val="BodyText"/>
+        <w:rPr>
+          <w:lang w:val="sr-Latn-CS"/>
+        </w:rPr>
+      </w:pPr>
+      <w:r>
+        <w:rPr>
+          <w:lang w:val="sr-Latn-CS"/>
+        </w:rPr>
         <w:t>Nema.</w:t>
       </w:r>
     </w:p>
     <w:p>
       <w:pPr>
         <w:pStyle w:val="BodyText"/>
+        <w:rPr>
+          <w:lang w:val="sr-Latn-CS"/>
+        </w:rPr>
+      </w:pPr>
+    </w:p>
+    <w:p>
+      <w:pPr>
+        <w:pStyle w:val="Heading1"/>
+        <w:rPr>
+          <w:lang w:val="sr-Latn-CS"/>
+        </w:rPr>
+      </w:pPr>
+      <w:r>
+        <w:rPr>
+          <w:lang w:val="sr-Latn-CS"/>
+        </w:rPr>
+        <w:t>Dodatni zahtevi</w:t>
+      </w:r>
+      <w:bookmarkEnd w:id="14"/>
+    </w:p>
+    <w:p>
+      <w:pPr>
+        <w:pStyle w:val="Heading2"/>
+        <w:rPr>
+          <w:lang w:val="sr-Latn-CS"/>
+        </w:rPr>
+      </w:pPr>
+      <w:bookmarkStart w:id="15" w:name="_Toc163018917"/>
+      <w:r>
+        <w:rPr>
+          <w:lang w:val="sr-Latn-CS"/>
+        </w:rPr>
+        <w:t>Funkcionalnost</w:t>
+      </w:r>
+      <w:bookmarkEnd w:id="15"/>
+    </w:p>
+    <w:p>
+      <w:pPr>
+        <w:pStyle w:val="BodyText"/>
+        <w:rPr>
+          <w:lang w:val="sr-Latn-CS"/>
+        </w:rPr>
+      </w:pPr>
+      <w:r>
+        <w:rPr>
+          <w:lang w:val="sr-Latn-CS"/>
+        </w:rPr>
+        <w:t>U ovom odeljku su specificirani funkcionalni zahtevi koji su zajednički za više slučajeva korišćenja</w:t>
+      </w:r>
+      <w:r>
+        <w:rPr>
+          <w:lang w:val="sr-Latn-CS"/>
+        </w:rPr>
+        <w:t>.</w:t>
+      </w:r>
+    </w:p>
+    <w:p>
+      <w:pPr>
+        <w:pStyle w:val="BodyText"/>
+        <w:rPr>
+          <w:lang w:val="sr-Latn-CS"/>
+        </w:rPr>
+      </w:pPr>
+      <w:r>
+        <w:rPr>
+          <w:lang w:val="sr-Latn-CS"/>
+        </w:rPr>
+        <w:t xml:space="preserve">OutfitFactory web aplikacija </w:t>
+      </w:r>
+      <w:r>
+        <w:rPr>
+          <w:lang w:val="sr-Latn-CS"/>
+        </w:rPr>
+        <w:t>ne zahteva nikakve dodatne funkcionalnosti</w:t>
+      </w:r>
+      <w:r>
+        <w:rPr>
+          <w:lang w:val="sr-Latn-CS"/>
+        </w:rPr>
+        <w:t>.</w:t>
+      </w:r>
+    </w:p>
+    <w:p>
+      <w:pPr>
+        <w:pStyle w:val="Heading2"/>
+        <w:rPr>
+          <w:lang w:val="sr-Latn-CS"/>
+        </w:rPr>
+      </w:pPr>
+      <w:bookmarkStart w:id="16" w:name="_Toc163018918"/>
+      <w:r>
+        <w:rPr>
+          <w:lang w:val="sr-Latn-CS"/>
+        </w:rPr>
+        <w:t>Upotrebivost</w:t>
+      </w:r>
+      <w:bookmarkEnd w:id="16"/>
+    </w:p>
+    <w:p>
+      <w:pPr>
+        <w:pStyle w:val="BodyText"/>
+        <w:rPr>
+          <w:lang w:val="sr-Latn-CS"/>
+        </w:rPr>
+      </w:pPr>
+      <w:r>
+        <w:rPr>
+          <w:lang w:val="sr-Latn-CS"/>
+        </w:rPr>
+        <w:t>U ovom odeljku su specificirani zahtevi</w:t>
+      </w:r>
+      <w:r>
+        <w:rPr>
+          <w:lang w:val="sr-Latn-CS"/>
+        </w:rPr>
+        <w:t xml:space="preserve"> koji su vezani za, ili utiču na </w:t>
+      </w:r>
+      <w:r>
+        <w:rPr>
+          <w:lang w:val="sr-Latn-CS"/>
+        </w:rPr>
+        <w:t>upotrebivosti sistema koji se razvija.</w:t>
+      </w:r>
+    </w:p>
+    <w:p>
+      <w:pPr>
+        <w:pStyle w:val="BodyText"/>
         <w:keepNext/>
         <w:rPr>
           <w:b/>
@@ -10453,45 +10985,34 @@
           <w:bCs/>
           <w:lang w:val="sr-Latn-CS"/>
         </w:rPr>
-        <w:t>Posledice:</w:t>
-      </w:r>
-    </w:p>
-    <w:p>
-      <w:pPr>
-        <w:pStyle w:val="BodyText"/>
-        <w:rPr>
-          <w:lang w:val="sr-Latn-CS"/>
-        </w:rPr>
-      </w:pPr>
-      <w:r>
-        <w:rPr>
-          <w:lang w:val="sr-Latn-CS"/>
-        </w:rPr>
-        <w:t>Nema.</w:t>
-      </w:r>
-    </w:p>
-    <w:p>
-      <w:pPr>
-        <w:pStyle w:val="BodyText"/>
-        <w:rPr>
-          <w:lang w:val="sr-Latn-CS"/>
-        </w:rPr>
-      </w:pPr>
-    </w:p>
-    <w:p>
-      <w:pPr>
-        <w:pStyle w:val="Heading1"/>
-        <w:rPr>
-          <w:lang w:val="sr-Latn-CS"/>
-        </w:rPr>
-      </w:pPr>
-      <w:r>
-        <w:rPr>
-          <w:lang w:val="sr-Latn-CS"/>
-        </w:rPr>
-        <w:t>Dodatni zahtevi</w:t>
-      </w:r>
-      <w:bookmarkEnd w:id="15"/>
+        <w:t>Korisnički interfejs prilagođen korisniku:</w:t>
+      </w:r>
+    </w:p>
+    <w:p>
+      <w:pPr>
+        <w:pStyle w:val="BodyText"/>
+        <w:rPr>
+          <w:lang w:val="sr-Latn-CS"/>
+        </w:rPr>
+      </w:pPr>
+      <w:r>
+        <w:rPr>
+          <w:lang w:val="sr-Latn-CS"/>
+        </w:rPr>
+        <w:t xml:space="preserve">Korisnički interfejs </w:t>
+      </w:r>
+      <w:r>
+        <w:rPr>
+          <w:lang w:val="sr-Latn-CS"/>
+        </w:rPr>
+        <w:t xml:space="preserve">OutfitFactory </w:t>
+      </w:r>
+      <w:r>
+        <w:rPr>
+          <w:lang w:val="sr-Latn-CS"/>
+        </w:rPr>
+        <w:t xml:space="preserve">će biti dizajniran tako da bude omogućeno jednostavno i intuitivno korišćenje bez potrebe za organizovanjem dodatne obuke. </w:t>
+      </w:r>
     </w:p>
     <w:p>
       <w:pPr>
@@ -10500,27 +11021,224 @@
           <w:lang w:val="sr-Latn-CS"/>
         </w:rPr>
       </w:pPr>
-      <w:bookmarkStart w:id="16" w:name="_Toc163018917"/>
-      <w:r>
-        <w:rPr>
-          <w:lang w:val="sr-Latn-CS"/>
-        </w:rPr>
-        <w:t>Funkcionalnost</w:t>
-      </w:r>
-      <w:bookmarkEnd w:id="16"/>
-    </w:p>
-    <w:p>
-      <w:pPr>
-        <w:pStyle w:val="BodyText"/>
-        <w:rPr>
-          <w:lang w:val="sr-Latn-CS"/>
-        </w:rPr>
-      </w:pPr>
-      <w:r>
-        <w:rPr>
-          <w:lang w:val="sr-Latn-CS"/>
-        </w:rPr>
-        <w:t>U ovom odeljku su specificirani funkcionalni zahtevi koji su zajednički za više slučajeva korišćenja</w:t>
+      <w:bookmarkStart w:id="17" w:name="_Toc163018919"/>
+      <w:r>
+        <w:rPr>
+          <w:lang w:val="sr-Latn-CS"/>
+        </w:rPr>
+        <w:t>Pouzdanost</w:t>
+      </w:r>
+      <w:bookmarkEnd w:id="17"/>
+    </w:p>
+    <w:p>
+      <w:pPr>
+        <w:pStyle w:val="BodyText"/>
+        <w:rPr>
+          <w:lang w:val="sr-Latn-CS"/>
+        </w:rPr>
+      </w:pPr>
+      <w:r>
+        <w:rPr>
+          <w:lang w:val="sr-Latn-CS"/>
+        </w:rPr>
+        <w:t>U ovom odeljku su specificirani zahtevi u pogledu pouzdanosti sistema koji se razvija.</w:t>
+      </w:r>
+    </w:p>
+    <w:p>
+      <w:pPr>
+        <w:pStyle w:val="BodyText"/>
+        <w:keepNext/>
+        <w:rPr>
+          <w:b/>
+          <w:bCs/>
+          <w:lang w:val="sr-Latn-CS"/>
+        </w:rPr>
+      </w:pPr>
+      <w:r>
+        <w:rPr>
+          <w:b/>
+          <w:bCs/>
+          <w:lang w:val="sr-Latn-CS"/>
+        </w:rPr>
+        <w:t>Dostupnost</w:t>
+      </w:r>
+      <w:r>
+        <w:rPr>
+          <w:b/>
+          <w:bCs/>
+          <w:lang w:val="sr-Latn-CS"/>
+        </w:rPr>
+        <w:t>:</w:t>
+      </w:r>
+    </w:p>
+    <w:p>
+      <w:pPr>
+        <w:pStyle w:val="BodyText"/>
+        <w:rPr>
+          <w:lang w:val="sr-Latn-CS"/>
+        </w:rPr>
+      </w:pPr>
+      <w:r>
+        <w:rPr>
+          <w:lang w:val="sr-Latn-CS"/>
+        </w:rPr>
+        <w:t>OutfitFactory web aplikacija će biti dostup</w:t>
+      </w:r>
+      <w:r>
+        <w:rPr>
+          <w:lang w:val="sr-Latn-CS"/>
+        </w:rPr>
+        <w:t>n</w:t>
+      </w:r>
+      <w:r>
+        <w:rPr>
+          <w:lang w:val="sr-Latn-CS"/>
+        </w:rPr>
+        <w:t>a</w:t>
+      </w:r>
+      <w:r>
+        <w:rPr>
+          <w:lang w:val="sr-Latn-CS"/>
+        </w:rPr>
+        <w:t xml:space="preserve"> 24 časa dnevno, 7 dana u nedelji. Vreme kada portal nije dostupan ne sme da pređe 10%.</w:t>
+      </w:r>
+    </w:p>
+    <w:p>
+      <w:pPr>
+        <w:pStyle w:val="BodyText"/>
+        <w:keepNext/>
+        <w:rPr>
+          <w:b/>
+          <w:bCs/>
+          <w:lang w:val="sr-Latn-CS"/>
+        </w:rPr>
+      </w:pPr>
+      <w:r>
+        <w:rPr>
+          <w:b/>
+          <w:bCs/>
+          <w:lang w:val="sr-Latn-CS"/>
+        </w:rPr>
+        <w:t>Srednje</w:t>
+      </w:r>
+      <w:r>
+        <w:rPr>
+          <w:b/>
+          <w:bCs/>
+          <w:lang w:val="sr-Latn-CS"/>
+        </w:rPr>
+        <w:t>vreme između otkaza</w:t>
+      </w:r>
+      <w:r>
+        <w:rPr>
+          <w:b/>
+          <w:bCs/>
+          <w:lang w:val="sr-Latn-CS"/>
+        </w:rPr>
+        <w:t>:</w:t>
+      </w:r>
+    </w:p>
+    <w:p>
+      <w:pPr>
+        <w:pStyle w:val="BodyText"/>
+        <w:rPr>
+          <w:lang w:val="sr-Latn-CS"/>
+        </w:rPr>
+      </w:pPr>
+      <w:r>
+        <w:rPr>
+          <w:lang w:val="sr-Latn-CS"/>
+        </w:rPr>
+        <w:t xml:space="preserve">Srednje vreme između dva sukcesivna otkaza ne sme da padne ispod </w:t>
+      </w:r>
+      <w:r>
+        <w:rPr>
+          <w:lang w:val="sr-Latn-CS"/>
+        </w:rPr>
+        <w:t xml:space="preserve">150 </w:t>
+      </w:r>
+      <w:r>
+        <w:rPr>
+          <w:lang w:val="sr-Latn-CS"/>
+        </w:rPr>
+        <w:t>sati.</w:t>
+      </w:r>
+    </w:p>
+    <w:p>
+      <w:pPr>
+        <w:pStyle w:val="Heading2"/>
+        <w:rPr>
+          <w:lang w:val="sr-Latn-CS"/>
+        </w:rPr>
+      </w:pPr>
+      <w:bookmarkStart w:id="18" w:name="_Toc163018920"/>
+      <w:r>
+        <w:rPr>
+          <w:lang w:val="sr-Latn-CS"/>
+        </w:rPr>
+        <w:t>Performanse</w:t>
+      </w:r>
+      <w:bookmarkEnd w:id="18"/>
+    </w:p>
+    <w:p>
+      <w:pPr>
+        <w:pStyle w:val="BodyText"/>
+        <w:rPr>
+          <w:lang w:val="sr-Latn-CS"/>
+        </w:rPr>
+      </w:pPr>
+      <w:r>
+        <w:rPr>
+          <w:lang w:val="sr-Latn-CS"/>
+        </w:rPr>
+        <w:t>U ovom odeljku su specificirani zahtevi koji definišu željene performanse sistema koji se razvija.</w:t>
+      </w:r>
+    </w:p>
+    <w:p>
+      <w:pPr>
+        <w:pStyle w:val="BodyText"/>
+        <w:keepNext/>
+        <w:rPr>
+          <w:b/>
+          <w:bCs/>
+          <w:lang w:val="sr-Latn-CS"/>
+        </w:rPr>
+      </w:pPr>
+      <w:r>
+        <w:rPr>
+          <w:b/>
+          <w:bCs/>
+          <w:lang w:val="sr-Latn-CS"/>
+        </w:rPr>
+        <w:t>Broj korisnika koji simultano pristupaju</w:t>
+      </w:r>
+      <w:r>
+        <w:rPr>
+          <w:b/>
+          <w:bCs/>
+          <w:lang w:val="sr-Latn-CS"/>
+        </w:rPr>
+        <w:t>:</w:t>
+      </w:r>
+    </w:p>
+    <w:p>
+      <w:pPr>
+        <w:pStyle w:val="BodyText"/>
+        <w:rPr>
+          <w:lang w:val="sr-Latn-CS"/>
+        </w:rPr>
+      </w:pPr>
+      <w:r>
+        <w:rPr>
+          <w:lang w:val="sr-Latn-CS"/>
+        </w:rPr>
+        <w:t>Sistem će da podrži do 1000 simultanih pristupa korisnika</w:t>
+      </w:r>
+      <w:r>
+        <w:rPr>
+          <w:lang w:val="sr-Latn-CS"/>
+        </w:rPr>
+        <w:t xml:space="preserve"> portalu</w:t>
       </w:r>
       <w:r>
         <w:rPr>
@@ -10532,27 +11250,80 @@
     <w:p>
       <w:pPr>
         <w:pStyle w:val="BodyText"/>
-        <w:rPr>
-          <w:lang w:val="sr-Latn-CS"/>
-        </w:rPr>
-      </w:pPr>
-      <w:r>
-        <w:rPr>
-          <w:lang w:val="sr-Latn-CS"/>
-        </w:rPr>
-        <w:t xml:space="preserve">OutfitFactory web aplikacija </w:t>
-      </w:r>
-      <w:r>
-        <w:rPr>
-          <w:lang w:val="sr-Latn-CS"/>
-        </w:rPr>
-        <w:t>ne zahteva nikakve dodatne funkcionalnosti</w:t>
-      </w:r>
-      <w:r>
-        <w:rPr>
-          <w:lang w:val="sr-Latn-CS"/>
-        </w:rPr>
-        <w:t>.</w:t>
+        <w:keepNext/>
+        <w:rPr>
+          <w:b/>
+          <w:bCs/>
+          <w:lang w:val="sr-Latn-CS"/>
+        </w:rPr>
+      </w:pPr>
+      <w:r>
+        <w:rPr>
+          <w:b/>
+          <w:bCs/>
+          <w:lang w:val="sr-Latn-CS"/>
+        </w:rPr>
+        <w:t xml:space="preserve">Vreme odziva </w:t>
+      </w:r>
+      <w:r>
+        <w:rPr>
+          <w:b/>
+          <w:bCs/>
+          <w:lang w:val="sr-Latn-CS"/>
+        </w:rPr>
+        <w:t xml:space="preserve">za pristup </w:t>
+      </w:r>
+      <w:r>
+        <w:rPr>
+          <w:b/>
+          <w:bCs/>
+          <w:lang w:val="sr-Latn-CS"/>
+        </w:rPr>
+        <w:t>baz</w:t>
+      </w:r>
+      <w:r>
+        <w:rPr>
+          <w:b/>
+          <w:bCs/>
+          <w:lang w:val="sr-Latn-CS"/>
+        </w:rPr>
+        <w:t>i</w:t>
+      </w:r>
+      <w:r>
+        <w:rPr>
+          <w:b/>
+          <w:bCs/>
+          <w:lang w:val="sr-Latn-CS"/>
+        </w:rPr>
+        <w:t xml:space="preserve"> podataka</w:t>
+      </w:r>
+      <w:r>
+        <w:rPr>
+          <w:b/>
+          <w:bCs/>
+          <w:lang w:val="sr-Latn-CS"/>
+        </w:rPr>
+        <w:t>:</w:t>
+      </w:r>
+    </w:p>
+    <w:p>
+      <w:pPr>
+        <w:pStyle w:val="BodyText"/>
+        <w:rPr>
+          <w:lang w:val="sr-Latn-CS"/>
+        </w:rPr>
+      </w:pPr>
+      <w:r>
+        <w:rPr>
+          <w:lang w:val="sr-Latn-CS"/>
+        </w:rPr>
+        <w:t>Vreme potrebno za pristupanje bazi podataka u cilju izvršenje nekog upita ne sme da veće od 5 sekundi.</w:t>
+      </w:r>
+      <w:r>
+        <w:rPr>
+          <w:lang w:val="sr-Latn-CS"/>
+        </w:rPr>
+        <w:t xml:space="preserve"> </w:t>
       </w:r>
     </w:p>
     <w:p>
@@ -10562,418 +11333,7 @@
           <w:lang w:val="sr-Latn-CS"/>
         </w:rPr>
       </w:pPr>
-      <w:bookmarkStart w:id="17" w:name="_Toc163018918"/>
-      <w:r>
-        <w:rPr>
-          <w:lang w:val="sr-Latn-CS"/>
-        </w:rPr>
-        <w:t>Upotrebivost</w:t>
-      </w:r>
-      <w:bookmarkEnd w:id="17"/>
-    </w:p>
-    <w:p>
-      <w:pPr>
-        <w:pStyle w:val="BodyText"/>
-        <w:rPr>
-          <w:lang w:val="sr-Latn-CS"/>
-        </w:rPr>
-      </w:pPr>
-      <w:r>
-        <w:rPr>
-          <w:lang w:val="sr-Latn-CS"/>
-        </w:rPr>
-        <w:t>U ovom odeljku su specificirani zahtevi</w:t>
-      </w:r>
-      <w:r>
-        <w:rPr>
-          <w:lang w:val="sr-Latn-CS"/>
-        </w:rPr>
-        <w:t xml:space="preserve"> koji su vezani za, ili utiču na </w:t>
-      </w:r>
-      <w:r>
-        <w:rPr>
-          <w:lang w:val="sr-Latn-CS"/>
-        </w:rPr>
-        <w:t>upotrebivosti sistema koji se razvija.</w:t>
-      </w:r>
-    </w:p>
-    <w:p>
-      <w:pPr>
-        <w:pStyle w:val="BodyText"/>
-        <w:keepNext/>
-        <w:rPr>
-          <w:b/>
-          <w:bCs/>
-          <w:lang w:val="sr-Latn-CS"/>
-        </w:rPr>
-      </w:pPr>
-      <w:r>
-        <w:rPr>
-          <w:b/>
-          <w:bCs/>
-          <w:lang w:val="sr-Latn-CS"/>
-        </w:rPr>
-        <w:t>Korisnički interfejs prilagođen korisniku:</w:t>
-      </w:r>
-    </w:p>
-    <w:p>
-      <w:pPr>
-        <w:pStyle w:val="BodyText"/>
-        <w:rPr>
-          <w:lang w:val="sr-Latn-CS"/>
-        </w:rPr>
-      </w:pPr>
-      <w:r>
-        <w:rPr>
-          <w:lang w:val="sr-Latn-CS"/>
-        </w:rPr>
-        <w:t xml:space="preserve">Korisnički interfejs </w:t>
-      </w:r>
-      <w:r>
-        <w:rPr>
-          <w:lang w:val="sr-Latn-CS"/>
-        </w:rPr>
-        <w:t xml:space="preserve">OutfitFactory </w:t>
-      </w:r>
-      <w:r>
-        <w:rPr>
-          <w:lang w:val="sr-Latn-CS"/>
-        </w:rPr>
-        <w:t xml:space="preserve">će biti dizajniran tako da bude omogućeno jednostavno i intuitivno korišćenje bez potrebe za organizovanjem dodatne obuke. </w:t>
-      </w:r>
-    </w:p>
-    <w:p>
-      <w:pPr>
-        <w:pStyle w:val="Heading2"/>
-        <w:rPr>
-          <w:lang w:val="sr-Latn-CS"/>
-        </w:rPr>
-      </w:pPr>
-      <w:bookmarkStart w:id="18" w:name="_Toc163018919"/>
-      <w:r>
-        <w:rPr>
-          <w:lang w:val="sr-Latn-CS"/>
-        </w:rPr>
-        <w:t>Pouzdanost</w:t>
-      </w:r>
-      <w:bookmarkEnd w:id="18"/>
-    </w:p>
-    <w:p>
-      <w:pPr>
-        <w:pStyle w:val="BodyText"/>
-        <w:rPr>
-          <w:lang w:val="sr-Latn-CS"/>
-        </w:rPr>
-      </w:pPr>
-      <w:r>
-        <w:rPr>
-          <w:lang w:val="sr-Latn-CS"/>
-        </w:rPr>
-        <w:t>U ovom odeljku su specificirani zahtevi u pogledu pouzdanosti sistema koji se razvija.</w:t>
-      </w:r>
-    </w:p>
-    <w:p>
-      <w:pPr>
-        <w:pStyle w:val="BodyText"/>
-        <w:keepNext/>
-        <w:rPr>
-          <w:b/>
-          <w:bCs/>
-          <w:lang w:val="sr-Latn-CS"/>
-        </w:rPr>
-      </w:pPr>
-      <w:r>
-        <w:rPr>
-          <w:b/>
-          <w:bCs/>
-          <w:lang w:val="sr-Latn-CS"/>
-        </w:rPr>
-        <w:t>Dostupnost</w:t>
-      </w:r>
-      <w:r>
-        <w:rPr>
-          <w:b/>
-          <w:bCs/>
-          <w:lang w:val="sr-Latn-CS"/>
-        </w:rPr>
-        <w:t>:</w:t>
-      </w:r>
-    </w:p>
-    <w:p>
-      <w:pPr>
-        <w:pStyle w:val="BodyText"/>
-        <w:rPr>
-          <w:lang w:val="sr-Latn-CS"/>
-        </w:rPr>
-      </w:pPr>
-      <w:r>
-        <w:rPr>
-          <w:lang w:val="sr-Latn-CS"/>
-        </w:rPr>
-        <w:t>OutfitFactory web aplikacija će biti dostup</w:t>
-      </w:r>
-      <w:r>
-        <w:rPr>
-          <w:lang w:val="sr-Latn-CS"/>
-        </w:rPr>
-        <w:t>n</w:t>
-      </w:r>
-      <w:r>
-        <w:rPr>
-          <w:lang w:val="sr-Latn-CS"/>
-        </w:rPr>
-        <w:t>a</w:t>
-      </w:r>
-      <w:r>
-        <w:rPr>
-          <w:lang w:val="sr-Latn-CS"/>
-        </w:rPr>
-        <w:t xml:space="preserve"> 24 časa dnevno, 7 dana u nedelji. Vreme kada portal nije dostupan ne sme da pređe 10%.</w:t>
-      </w:r>
-    </w:p>
-    <w:p>
-      <w:pPr>
-        <w:pStyle w:val="BodyText"/>
-        <w:keepNext/>
-        <w:rPr>
-          <w:b/>
-          <w:bCs/>
-          <w:lang w:val="sr-Latn-CS"/>
-        </w:rPr>
-      </w:pPr>
-      <w:r>
-        <w:rPr>
-          <w:b/>
-          <w:bCs/>
-          <w:lang w:val="sr-Latn-CS"/>
-        </w:rPr>
-        <w:t>Srednje</w:t>
-      </w:r>
-      <w:r>
-        <w:rPr>
-          <w:b/>
-          <w:bCs/>
-          <w:lang w:val="sr-Latn-CS"/>
-        </w:rPr>
-        <w:t>vreme između otkaza</w:t>
-      </w:r>
-      <w:r>
-        <w:rPr>
-          <w:b/>
-          <w:bCs/>
-          <w:lang w:val="sr-Latn-CS"/>
-        </w:rPr>
-        <w:t>:</w:t>
-      </w:r>
-    </w:p>
-    <w:p>
-      <w:pPr>
-        <w:pStyle w:val="BodyText"/>
-        <w:rPr>
-          <w:lang w:val="sr-Latn-CS"/>
-        </w:rPr>
-      </w:pPr>
-      <w:r>
-        <w:rPr>
-          <w:lang w:val="sr-Latn-CS"/>
-        </w:rPr>
-        <w:t xml:space="preserve">Srednje vreme između dva sukcesivna otkaza ne sme da padne ispod </w:t>
-      </w:r>
-      <w:r>
-        <w:rPr>
-          <w:lang w:val="sr-Latn-CS"/>
-        </w:rPr>
-        <w:t xml:space="preserve">150 </w:t>
-      </w:r>
-      <w:r>
-        <w:rPr>
-          <w:lang w:val="sr-Latn-CS"/>
-        </w:rPr>
-        <w:t>sati.</w:t>
-      </w:r>
-    </w:p>
-    <w:p>
-      <w:pPr>
-        <w:pStyle w:val="Heading2"/>
-        <w:rPr>
-          <w:lang w:val="sr-Latn-CS"/>
-        </w:rPr>
-      </w:pPr>
-      <w:bookmarkStart w:id="19" w:name="_Toc163018920"/>
-      <w:r>
-        <w:rPr>
-          <w:lang w:val="sr-Latn-CS"/>
-        </w:rPr>
-        <w:t>Performanse</w:t>
-      </w:r>
-      <w:bookmarkEnd w:id="19"/>
-    </w:p>
-    <w:p>
-      <w:pPr>
-        <w:pStyle w:val="BodyText"/>
-        <w:rPr>
-          <w:lang w:val="sr-Latn-CS"/>
-        </w:rPr>
-      </w:pPr>
-      <w:r>
-        <w:rPr>
-          <w:lang w:val="sr-Latn-CS"/>
-        </w:rPr>
-        <w:t>U ovom odeljku su specificirani zahtevi koji definišu željene performanse sistema koji se razvija.</w:t>
-      </w:r>
-    </w:p>
-    <w:p>
-      <w:pPr>
-        <w:pStyle w:val="BodyText"/>
-        <w:keepNext/>
-        <w:rPr>
-          <w:b/>
-          <w:bCs/>
-          <w:lang w:val="sr-Latn-CS"/>
-        </w:rPr>
-      </w:pPr>
-      <w:r>
-        <w:rPr>
-          <w:b/>
-          <w:bCs/>
-          <w:lang w:val="sr-Latn-CS"/>
-        </w:rPr>
-        <w:t>Broj korisnika koji simultano pristupaju</w:t>
-      </w:r>
-      <w:r>
-        <w:rPr>
-          <w:b/>
-          <w:bCs/>
-          <w:lang w:val="sr-Latn-CS"/>
-        </w:rPr>
-        <w:t>:</w:t>
-      </w:r>
-    </w:p>
-    <w:p>
-      <w:pPr>
-        <w:pStyle w:val="BodyText"/>
-        <w:rPr>
-          <w:lang w:val="sr-Latn-CS"/>
-        </w:rPr>
-      </w:pPr>
-      <w:r>
-        <w:rPr>
-          <w:lang w:val="sr-Latn-CS"/>
-        </w:rPr>
-        <w:t>Sistem će da podrži do 1000 simultanih pristupa korisnika</w:t>
-      </w:r>
-      <w:r>
-        <w:rPr>
-          <w:lang w:val="sr-Latn-CS"/>
-        </w:rPr>
-        <w:t xml:space="preserve"> portalu</w:t>
-      </w:r>
-      <w:r>
-        <w:rPr>
-          <w:lang w:val="sr-Latn-CS"/>
-        </w:rPr>
-        <w:t>.</w:t>
-      </w:r>
-      <w:r>
-        <w:rPr>
-          <w:lang w:val="sr-Latn-CS"/>
-        </w:rPr>
-        <w:t xml:space="preserve"> </w:t>
-      </w:r>
-      <w:r>
-        <w:rPr>
-          <w:lang w:val="sr-Latn-CS"/>
-        </w:rPr>
-        <w:t>//</w:t>
-      </w:r>
-    </w:p>
-    <w:p>
-      <w:pPr>
-        <w:pStyle w:val="BodyText"/>
-        <w:keepNext/>
-        <w:rPr>
-          <w:b/>
-          <w:bCs/>
-          <w:lang w:val="sr-Latn-CS"/>
-        </w:rPr>
-      </w:pPr>
-      <w:r>
-        <w:rPr>
-          <w:b/>
-          <w:bCs/>
-          <w:lang w:val="sr-Latn-CS"/>
-        </w:rPr>
-        <w:t xml:space="preserve">Vreme odziva </w:t>
-      </w:r>
-      <w:r>
-        <w:rPr>
-          <w:b/>
-          <w:bCs/>
-          <w:lang w:val="sr-Latn-CS"/>
-        </w:rPr>
-        <w:t xml:space="preserve">za pristup </w:t>
-      </w:r>
-      <w:r>
-        <w:rPr>
-          <w:b/>
-          <w:bCs/>
-          <w:lang w:val="sr-Latn-CS"/>
-        </w:rPr>
-        <w:t>baz</w:t>
-      </w:r>
-      <w:r>
-        <w:rPr>
-          <w:b/>
-          <w:bCs/>
-          <w:lang w:val="sr-Latn-CS"/>
-        </w:rPr>
-        <w:t>i</w:t>
-      </w:r>
-      <w:r>
-        <w:rPr>
-          <w:b/>
-          <w:bCs/>
-          <w:lang w:val="sr-Latn-CS"/>
-        </w:rPr>
-        <w:t xml:space="preserve"> podataka</w:t>
-      </w:r>
-      <w:r>
-        <w:rPr>
-          <w:b/>
-          <w:bCs/>
-          <w:lang w:val="sr-Latn-CS"/>
-        </w:rPr>
-        <w:t>:</w:t>
-      </w:r>
-    </w:p>
-    <w:p>
-      <w:pPr>
-        <w:pStyle w:val="BodyText"/>
-        <w:rPr>
-          <w:lang w:val="sr-Latn-CS"/>
-        </w:rPr>
-      </w:pPr>
-      <w:r>
-        <w:rPr>
-          <w:lang w:val="sr-Latn-CS"/>
-        </w:rPr>
-        <w:t>Vreme potrebno za pristupanje bazi podataka u cilju izvršenje nekog upita ne sme da veće od 5 sekundi.</w:t>
-      </w:r>
-      <w:r>
-        <w:rPr>
-          <w:lang w:val="sr-Latn-CS"/>
-        </w:rPr>
-        <w:t xml:space="preserve"> </w:t>
-      </w:r>
-    </w:p>
-    <w:p>
-      <w:pPr>
-        <w:pStyle w:val="Heading2"/>
-        <w:rPr>
-          <w:lang w:val="sr-Latn-CS"/>
-        </w:rPr>
-      </w:pPr>
-      <w:bookmarkStart w:id="20" w:name="_Toc163018921"/>
+      <w:bookmarkStart w:id="19" w:name="_Toc163018921"/>
       <w:r>
         <w:rPr>
           <w:lang w:val="sr-Latn-CS"/>
@@ -10981,6 +11341,62 @@
         <w:lastRenderedPageBreak/>
         <w:t>Podrška i održavanje</w:t>
       </w:r>
+      <w:bookmarkEnd w:id="19"/>
+    </w:p>
+    <w:p>
+      <w:pPr>
+        <w:pStyle w:val="BodyText"/>
+        <w:rPr>
+          <w:lang w:val="sr-Latn-CS"/>
+        </w:rPr>
+      </w:pPr>
+      <w:r>
+        <w:rPr>
+          <w:lang w:val="sr-Latn-CS"/>
+        </w:rPr>
+        <w:t>U ovom odeljku su specificirani zahtevi koji treba da poboljšaju stepen podrške i mogućnost održavanja sistema koji se razvija</w:t>
+      </w:r>
+      <w:r>
+        <w:rPr>
+          <w:lang w:val="sr-Latn-CS"/>
+        </w:rPr>
+        <w:t>.</w:t>
+      </w:r>
+    </w:p>
+    <w:p>
+      <w:pPr>
+        <w:pStyle w:val="BodyText"/>
+        <w:rPr>
+          <w:lang w:val="sr-Latn-CS"/>
+        </w:rPr>
+      </w:pPr>
+      <w:r>
+        <w:rPr>
+          <w:lang w:val="sr-Latn-CS"/>
+        </w:rPr>
+        <w:t xml:space="preserve">OutfitFactory web aplikacija </w:t>
+      </w:r>
+      <w:r>
+        <w:rPr>
+          <w:lang w:val="sr-Latn-CS"/>
+        </w:rPr>
+        <w:t>ne zahteva posebnu podršku i održavanje.</w:t>
+      </w:r>
+    </w:p>
+    <w:p>
+      <w:pPr>
+        <w:pStyle w:val="Heading2"/>
+        <w:rPr>
+          <w:lang w:val="sr-Latn-CS"/>
+        </w:rPr>
+      </w:pPr>
+      <w:bookmarkStart w:id="20" w:name="_Toc163018922"/>
+      <w:r>
+        <w:rPr>
+          <w:lang w:val="sr-Latn-CS"/>
+        </w:rPr>
+        <w:t>Ograničenja</w:t>
+      </w:r>
       <w:bookmarkEnd w:id="20"/>
     </w:p>
     <w:p>
@@ -10994,7 +11410,7 @@
         <w:rPr>
           <w:lang w:val="sr-Latn-CS"/>
         </w:rPr>
-        <w:t>U ovom odeljku su specificirani zahtevi koji treba da poboljšaju stepen podrške i mogućnost održavanja sistema koji se razvija</w:t>
+        <w:t>U ovom odeljku su specificirana ograničenja kojih se treba pridržavati pri projektovanju sistema koji se razvija</w:t>
       </w:r>
       <w:r>
         <w:rPr>
@@ -11006,225 +11422,297 @@
     <w:p>
       <w:pPr>
         <w:pStyle w:val="BodyText"/>
-        <w:rPr>
-          <w:lang w:val="sr-Latn-CS"/>
-        </w:rPr>
-      </w:pPr>
-      <w:r>
-        <w:rPr>
-          <w:lang w:val="sr-Latn-CS"/>
-        </w:rPr>
-        <w:t xml:space="preserve">OutfitFactory web aplikacija </w:t>
-      </w:r>
-      <w:r>
-        <w:rPr>
-          <w:lang w:val="sr-Latn-CS"/>
-        </w:rPr>
-        <w:t>ne zahteva posebnu podršku i održavanje.</w:t>
-      </w:r>
-    </w:p>
-    <w:p>
-      <w:pPr>
-        <w:pStyle w:val="Heading2"/>
-        <w:rPr>
-          <w:lang w:val="sr-Latn-CS"/>
-        </w:rPr>
-      </w:pPr>
-      <w:bookmarkStart w:id="21" w:name="_Toc163018922"/>
-      <w:r>
-        <w:rPr>
-          <w:lang w:val="sr-Latn-CS"/>
-        </w:rPr>
-        <w:t>Ograničenja</w:t>
-      </w:r>
+        <w:keepNext/>
+        <w:rPr>
+          <w:b/>
+          <w:bCs/>
+          <w:lang w:val="sr-Latn-CS"/>
+        </w:rPr>
+      </w:pPr>
+      <w:r>
+        <w:rPr>
+          <w:b/>
+          <w:bCs/>
+          <w:lang w:val="sr-Latn-CS"/>
+        </w:rPr>
+        <w:t>Hardverska platforma</w:t>
+      </w:r>
+      <w:r>
+        <w:rPr>
+          <w:b/>
+          <w:bCs/>
+          <w:lang w:val="sr-Latn-CS"/>
+        </w:rPr>
+        <w:t>:</w:t>
+      </w:r>
+    </w:p>
+    <w:p>
+      <w:pPr>
+        <w:pStyle w:val="BodyText"/>
+        <w:rPr>
+          <w:lang w:val="sr-Latn-CS"/>
+        </w:rPr>
+      </w:pPr>
+      <w:r>
+        <w:rPr>
+          <w:lang w:val="sr-Latn-CS"/>
+        </w:rPr>
+        <w:t xml:space="preserve">Klijentski deo sistema treba da ima mogućnost izvršavanja na bilo kom PC računaru sa minimum </w:t>
+      </w:r>
+      <w:r>
+        <w:t xml:space="preserve">AMD FX-8350 </w:t>
+      </w:r>
+      <w:r>
+        <w:rPr>
+          <w:lang w:val="sr-Latn-CS"/>
+        </w:rPr>
+        <w:t xml:space="preserve">procesorom i </w:t>
+      </w:r>
+      <w:r>
+        <w:rPr>
+          <w:lang w:val="sr-Latn-CS"/>
+        </w:rPr>
+        <w:t>2</w:t>
+      </w:r>
+      <w:r>
+        <w:rPr>
+          <w:lang w:val="sr-Latn-CS"/>
+        </w:rPr>
+        <w:t xml:space="preserve">GB </w:t>
+      </w:r>
+      <w:r>
+        <w:rPr>
+          <w:lang w:val="sr-Latn-CS"/>
+        </w:rPr>
+        <w:t xml:space="preserve">RAM memorije. </w:t>
+      </w:r>
+    </w:p>
+    <w:p>
+      <w:pPr>
+        <w:pStyle w:val="BodyText"/>
+        <w:rPr>
+          <w:lang w:val="sr-Latn-CS"/>
+        </w:rPr>
+      </w:pPr>
+      <w:r>
+        <w:rPr>
+          <w:lang w:val="sr-Latn-CS"/>
+        </w:rPr>
+        <w:t xml:space="preserve">Serverski deo sistema će raditi na </w:t>
+      </w:r>
+      <w:r>
+        <w:rPr>
+          <w:lang w:val="sr-Latn-CS"/>
+        </w:rPr>
+        <w:t>cloud serveru, pa mu nije potrebna hardverska platforma.</w:t>
+      </w:r>
+    </w:p>
+    <w:p>
+      <w:pPr>
+        <w:pStyle w:val="BodyText"/>
+        <w:keepNext/>
+        <w:rPr>
+          <w:b/>
+          <w:bCs/>
+          <w:lang w:val="sr-Latn-CS"/>
+        </w:rPr>
+      </w:pPr>
+      <w:r>
+        <w:rPr>
+          <w:b/>
+          <w:bCs/>
+          <w:lang w:val="sr-Latn-CS"/>
+        </w:rPr>
+        <w:t>Tipovi w</w:t>
+      </w:r>
+      <w:r>
+        <w:rPr>
+          <w:b/>
+          <w:bCs/>
+          <w:lang w:val="sr-Latn-CS"/>
+        </w:rPr>
+        <w:t>eb čitača</w:t>
+      </w:r>
+      <w:r>
+        <w:rPr>
+          <w:b/>
+          <w:bCs/>
+          <w:lang w:val="sr-Latn-CS"/>
+        </w:rPr>
+        <w:t>:</w:t>
+      </w:r>
+    </w:p>
+    <w:p>
+      <w:pPr>
+        <w:pStyle w:val="BodyText"/>
+        <w:rPr>
+          <w:lang w:val="sr-Latn-CS"/>
+        </w:rPr>
+      </w:pPr>
+      <w:r>
+        <w:rPr>
+          <w:lang w:val="sr-Latn-CS"/>
+        </w:rPr>
+        <w:t xml:space="preserve">Klijentski deo OutfitFactory web aplikacije </w:t>
+      </w:r>
+      <w:r>
+        <w:rPr>
+          <w:lang w:val="sr-Latn-CS"/>
+        </w:rPr>
+        <w:t xml:space="preserve">će biti </w:t>
+      </w:r>
+      <w:r>
+        <w:rPr>
+          <w:lang w:val="sr-Latn-CS"/>
+        </w:rPr>
+        <w:t>optimizova za sledeće w</w:t>
+      </w:r>
+      <w:r>
+        <w:rPr>
+          <w:lang w:val="sr-Latn-CS"/>
+        </w:rPr>
+        <w:t xml:space="preserve">eb čitače: </w:t>
+      </w:r>
+      <w:r>
+        <w:rPr>
+          <w:rStyle w:val="x193iq5w"/>
+        </w:rPr>
+        <w:t xml:space="preserve">Chrome (107 </w:t>
+      </w:r>
+      <w:proofErr w:type="spellStart"/>
+      <w:r>
+        <w:rPr>
+          <w:rStyle w:val="x193iq5w"/>
+        </w:rPr>
+        <w:t>i</w:t>
+      </w:r>
+      <w:proofErr w:type="spellEnd"/>
+      <w:r>
+        <w:rPr>
+          <w:rStyle w:val="x193iq5w"/>
+        </w:rPr>
+        <w:t xml:space="preserve"> </w:t>
+      </w:r>
+      <w:proofErr w:type="spellStart"/>
+      <w:r>
+        <w:rPr>
+          <w:rStyle w:val="x193iq5w"/>
+        </w:rPr>
+        <w:t>noviji</w:t>
+      </w:r>
+      <w:proofErr w:type="spellEnd"/>
+      <w:r>
+        <w:rPr>
+          <w:rStyle w:val="x193iq5w"/>
+        </w:rPr>
+        <w:t xml:space="preserve"> ), Edge (107 </w:t>
+      </w:r>
+      <w:proofErr w:type="spellStart"/>
+      <w:r>
+        <w:rPr>
+          <w:rStyle w:val="x193iq5w"/>
+        </w:rPr>
+        <w:t>i</w:t>
+      </w:r>
+      <w:proofErr w:type="spellEnd"/>
+      <w:r>
+        <w:rPr>
+          <w:rStyle w:val="x193iq5w"/>
+        </w:rPr>
+        <w:t xml:space="preserve"> </w:t>
+      </w:r>
+      <w:proofErr w:type="spellStart"/>
+      <w:r>
+        <w:rPr>
+          <w:rStyle w:val="x193iq5w"/>
+        </w:rPr>
+        <w:t>noviji</w:t>
+      </w:r>
+      <w:proofErr w:type="spellEnd"/>
+      <w:r>
+        <w:rPr>
+          <w:rStyle w:val="x193iq5w"/>
+        </w:rPr>
+        <w:t xml:space="preserve">), Firefox (104 </w:t>
+      </w:r>
+      <w:proofErr w:type="spellStart"/>
+      <w:r>
+        <w:rPr>
+          <w:rStyle w:val="x193iq5w"/>
+        </w:rPr>
+        <w:t>i</w:t>
+      </w:r>
+      <w:proofErr w:type="spellEnd"/>
+      <w:r>
+        <w:rPr>
+          <w:rStyle w:val="x193iq5w"/>
+        </w:rPr>
+        <w:t xml:space="preserve"> </w:t>
+      </w:r>
+      <w:proofErr w:type="spellStart"/>
+      <w:r>
+        <w:rPr>
+          <w:rStyle w:val="x193iq5w"/>
+        </w:rPr>
+        <w:t>noviji</w:t>
+      </w:r>
+      <w:proofErr w:type="spellEnd"/>
+      <w:r>
+        <w:rPr>
+          <w:rStyle w:val="x193iq5w"/>
+        </w:rPr>
+        <w:t xml:space="preserve">) </w:t>
+      </w:r>
+      <w:proofErr w:type="spellStart"/>
+      <w:r>
+        <w:rPr>
+          <w:rStyle w:val="x193iq5w"/>
+        </w:rPr>
+        <w:t>i</w:t>
+      </w:r>
+      <w:proofErr w:type="spellEnd"/>
+      <w:r>
+        <w:rPr>
+          <w:rStyle w:val="x193iq5w"/>
+        </w:rPr>
+        <w:t xml:space="preserve"> Safari (16 </w:t>
+      </w:r>
+      <w:proofErr w:type="spellStart"/>
+      <w:r>
+        <w:rPr>
+          <w:rStyle w:val="x193iq5w"/>
+        </w:rPr>
+        <w:t>i</w:t>
+      </w:r>
+      <w:proofErr w:type="spellEnd"/>
+      <w:r>
+        <w:rPr>
+          <w:rStyle w:val="x193iq5w"/>
+        </w:rPr>
+        <w:t xml:space="preserve"> </w:t>
+      </w:r>
+      <w:proofErr w:type="spellStart"/>
+      <w:r>
+        <w:rPr>
+          <w:rStyle w:val="x193iq5w"/>
+        </w:rPr>
+        <w:t>noviji</w:t>
+      </w:r>
+      <w:proofErr w:type="spellEnd"/>
+      <w:r>
+        <w:rPr>
+          <w:rStyle w:val="x193iq5w"/>
+        </w:rPr>
+        <w:t>)</w:t>
+      </w:r>
+      <w:r>
+        <w:rPr>
+          <w:rStyle w:val="x193iq5w"/>
+        </w:rPr>
+        <w:t xml:space="preserve">. </w:t>
+      </w:r>
+      <w:bookmarkStart w:id="21" w:name="_GoBack"/>
       <w:bookmarkEnd w:id="21"/>
-    </w:p>
-    <w:p>
-      <w:pPr>
-        <w:pStyle w:val="BodyText"/>
-        <w:rPr>
-          <w:lang w:val="sr-Latn-CS"/>
-        </w:rPr>
-      </w:pPr>
-      <w:r>
-        <w:rPr>
-          <w:lang w:val="sr-Latn-CS"/>
-        </w:rPr>
-        <w:t>U ovom odeljku su specificirana ograničenja kojih se treba pridržavati pri projektovanju sistema koji se razvija</w:t>
-      </w:r>
-      <w:r>
-        <w:rPr>
-          <w:lang w:val="sr-Latn-CS"/>
-        </w:rPr>
-        <w:t>.</w:t>
-      </w:r>
-    </w:p>
-    <w:p>
-      <w:pPr>
-        <w:pStyle w:val="BodyText"/>
-        <w:keepNext/>
-        <w:rPr>
-          <w:b/>
-          <w:bCs/>
-          <w:lang w:val="sr-Latn-CS"/>
-        </w:rPr>
-      </w:pPr>
-      <w:r>
-        <w:rPr>
-          <w:b/>
-          <w:bCs/>
-          <w:lang w:val="sr-Latn-CS"/>
-        </w:rPr>
-        <w:t>Hardverska platforma</w:t>
-      </w:r>
-      <w:r>
-        <w:rPr>
-          <w:b/>
-          <w:bCs/>
-          <w:lang w:val="sr-Latn-CS"/>
-        </w:rPr>
-        <w:t>:</w:t>
-      </w:r>
-    </w:p>
-    <w:p>
-      <w:pPr>
-        <w:pStyle w:val="BodyText"/>
-        <w:rPr>
-          <w:lang w:val="sr-Latn-CS"/>
-        </w:rPr>
-      </w:pPr>
-      <w:r>
-        <w:rPr>
-          <w:lang w:val="sr-Latn-CS"/>
-        </w:rPr>
-        <w:t xml:space="preserve">Klijentski deo sistema treba da ima mogućnost izvršavanja na bilo kom PC računaru sa minimum </w:t>
-      </w:r>
-      <w:r>
-        <w:t xml:space="preserve">AMD FX-8350 </w:t>
-      </w:r>
-      <w:r>
-        <w:rPr>
-          <w:lang w:val="sr-Latn-CS"/>
-        </w:rPr>
-        <w:t xml:space="preserve">procesorom i </w:t>
-      </w:r>
-      <w:r>
-        <w:rPr>
-          <w:lang w:val="sr-Latn-CS"/>
-        </w:rPr>
-        <w:t>2</w:t>
-      </w:r>
-      <w:r>
-        <w:rPr>
-          <w:lang w:val="sr-Latn-CS"/>
-        </w:rPr>
-        <w:t xml:space="preserve">GB </w:t>
-      </w:r>
-      <w:r>
-        <w:rPr>
-          <w:lang w:val="sr-Latn-CS"/>
-        </w:rPr>
-        <w:t xml:space="preserve">RAM memorije. </w:t>
-      </w:r>
-    </w:p>
-    <w:p>
-      <w:pPr>
-        <w:pStyle w:val="BodyText"/>
-        <w:rPr>
-          <w:lang w:val="sr-Latn-CS"/>
-        </w:rPr>
-      </w:pPr>
-      <w:r>
-        <w:rPr>
-          <w:lang w:val="sr-Latn-CS"/>
-        </w:rPr>
-        <w:t xml:space="preserve">Serverski deo sistema će raditi na </w:t>
-      </w:r>
-      <w:r>
-        <w:rPr>
-          <w:lang w:val="sr-Latn-CS"/>
-        </w:rPr>
-        <w:t>cloud serveru, pa mu nije potrebna hardverska platforma.</w:t>
-      </w:r>
-    </w:p>
-    <w:p>
-      <w:pPr>
-        <w:pStyle w:val="BodyText"/>
-        <w:keepNext/>
-        <w:rPr>
-          <w:b/>
-          <w:bCs/>
-          <w:lang w:val="sr-Latn-CS"/>
-        </w:rPr>
-      </w:pPr>
-      <w:r>
-        <w:rPr>
-          <w:b/>
-          <w:bCs/>
-          <w:lang w:val="sr-Latn-CS"/>
-        </w:rPr>
-        <w:t>Tipovi w</w:t>
-      </w:r>
-      <w:r>
-        <w:rPr>
-          <w:b/>
-          <w:bCs/>
-          <w:lang w:val="sr-Latn-CS"/>
-        </w:rPr>
-        <w:t>eb čitača</w:t>
-      </w:r>
-      <w:r>
-        <w:rPr>
-          <w:b/>
-          <w:bCs/>
-          <w:lang w:val="sr-Latn-CS"/>
-        </w:rPr>
-        <w:t>:</w:t>
-      </w:r>
-    </w:p>
-    <w:p>
-      <w:pPr>
-        <w:pStyle w:val="BodyText"/>
-        <w:rPr>
-          <w:lang w:val="sr-Latn-CS"/>
-        </w:rPr>
-      </w:pPr>
-      <w:r>
-        <w:rPr>
-          <w:lang w:val="sr-Latn-CS"/>
-        </w:rPr>
-        <w:t xml:space="preserve">Klijentski deo OutfitFactory web aplikacije </w:t>
-      </w:r>
-      <w:r>
-        <w:rPr>
-          <w:lang w:val="sr-Latn-CS"/>
-        </w:rPr>
-        <w:t xml:space="preserve">će biti </w:t>
-      </w:r>
-      <w:r>
-        <w:rPr>
-          <w:lang w:val="sr-Latn-CS"/>
-        </w:rPr>
-        <w:t>optimizova za sledeće w</w:t>
-      </w:r>
-      <w:r>
-        <w:rPr>
-          <w:lang w:val="sr-Latn-CS"/>
-        </w:rPr>
-        <w:t>eb čitače: Internet Explorer 6.0 i noviji, Opera 8.0 i noviji, kao i Firefox</w:t>
-      </w:r>
-      <w:r>
-        <w:rPr>
-          <w:lang w:val="sr-Latn-CS"/>
-        </w:rPr>
-        <w:t xml:space="preserve"> (Mozilla).</w:t>
-      </w:r>
-      <w:r>
-        <w:rPr>
-          <w:lang w:val="sr-Latn-CS"/>
-        </w:rPr>
-        <w:t xml:space="preserve"> //ovo pogledaj iz prve i sredi</w:t>
-      </w:r>
     </w:p>
     <w:sectPr>
       <w:headerReference w:type="default" r:id="rId17"/>
@@ -11424,7 +11912,7 @@
               <w:noProof/>
               <w:lang w:val="sr-Latn-CS"/>
             </w:rPr>
-            <w:t>2</w:t>
+            <w:t>17</w:t>
           </w:r>
           <w:r>
             <w:rPr>
@@ -11440,16 +11928,31 @@
             </w:rPr>
             <w:t xml:space="preserve"> od </w:t>
           </w:r>
-          <w:fldSimple w:instr=" NUMPAGES  \* MERGEFORMAT ">
-            <w:r>
-              <w:rPr>
-                <w:rStyle w:val="PageNumber"/>
-                <w:noProof/>
-                <w:lang w:val="sr-Latn-CS"/>
-              </w:rPr>
-              <w:t>17</w:t>
-            </w:r>
-          </w:fldSimple>
+          <w:r>
+            <w:fldChar w:fldCharType="begin"/>
+          </w:r>
+          <w:r>
+            <w:instrText xml:space="preserve"> NUMPAGES  \* MERGEFORMAT </w:instrText>
+          </w:r>
+          <w:r>
+            <w:fldChar w:fldCharType="separate"/>
+          </w:r>
+          <w:r>
+            <w:rPr>
+              <w:rStyle w:val="PageNumber"/>
+              <w:noProof/>
+              <w:lang w:val="sr-Latn-CS"/>
+            </w:rPr>
+            <w:t>17</w:t>
+          </w:r>
+          <w:r>
+            <w:rPr>
+              <w:rStyle w:val="PageNumber"/>
+              <w:noProof/>
+              <w:lang w:val="sr-Latn-CS"/>
+            </w:rPr>
+            <w:fldChar w:fldCharType="end"/>
+          </w:r>
         </w:p>
       </w:tc>
     </w:tr>
@@ -11523,6 +12026,7 @@
         <w:sz w:val="24"/>
       </w:rPr>
     </w:pPr>
+    <w:proofErr w:type="spellStart"/>
     <w:r>
       <w:rPr>
         <w:rFonts w:ascii="Arial" w:hAnsi="Arial"/>
@@ -11531,6 +12035,7 @@
       </w:rPr>
       <w:t>GatoHeads</w:t>
     </w:r>
+    <w:proofErr w:type="spellEnd"/>
   </w:p>
   <w:p>
     <w:pPr>
@@ -11598,13 +12103,7 @@
             <w:rPr>
               <w:lang w:val="sr-Latn-CS"/>
             </w:rPr>
-            <w:t xml:space="preserve">  </w:t>
-          </w:r>
-          <w:r>
-            <w:rPr>
-              <w:lang w:val="sr-Latn-CS"/>
-            </w:rPr>
-            <w:t>Verzija:           1.1</w:t>
+            <w:t xml:space="preserve">  Verzija:           1.1</w:t>
           </w:r>
         </w:p>
       </w:tc>
@@ -11642,13 +12141,7 @@
             <w:rPr>
               <w:lang w:val="sr-Latn-CS"/>
             </w:rPr>
-            <w:t xml:space="preserve">  Datum:  28</w:t>
-          </w:r>
-          <w:r>
-            <w:rPr>
-              <w:lang w:val="sr-Latn-CS"/>
-            </w:rPr>
-            <w:t>.10.2025</w:t>
+            <w:t xml:space="preserve">  Datum:  28.10.2025</w:t>
           </w:r>
           <w:r>
             <w:rPr>
@@ -15154,6 +15647,7 @@
   <w:style w:type="character" w:default="1" w:styleId="DefaultParagraphFont">
     <w:name w:val="Default Paragraph Font"/>
     <w:uiPriority w:val="1"/>
+    <w:semiHidden/>
     <w:unhideWhenUsed/>
   </w:style>
   <w:style w:type="table" w:default="1" w:styleId="TableNormal">
@@ -15456,6 +15950,10 @@
       <w:szCs w:val="16"/>
       <w:lang w:eastAsia="sr-Latn-CS"/>
     </w:rPr>
+  </w:style>
+  <w:style w:type="character" w:customStyle="1" w:styleId="x193iq5w">
+    <w:name w:val="x193iq5w"/>
+    <w:rsid w:val="004351AA"/>
   </w:style>
 </w:styles>
 </file>

</xml_diff>